<commit_message>
docs: write complete phase 1 report
</commit_message>
<xml_diff>
--- a/First Brief Report Template.docx
+++ b/First Brief Report Template.docx
@@ -4,7 +4,7 @@
   <w:body>
     <w:p>
       <w:pPr>
-        <w:pStyle w:val="Heading1"/>
+        <w:pStyle w:val="1"/>
         <w:jc w:val="center"/>
         <w:rPr>
           <w:rFonts w:ascii="Times New Roman" w:hAnsi="Times New Roman" w:cs="Times New Roman"/>
@@ -31,7 +31,7 @@
     </w:p>
     <w:p>
       <w:pPr>
-        <w:pStyle w:val="Heading2"/>
+        <w:pStyle w:val="2"/>
         <w:jc w:val="center"/>
         <w:rPr>
           <w:rFonts w:ascii="Times New Roman" w:hAnsi="Times New Roman" w:cs="Times New Roman"/>
@@ -64,7 +64,7 @@
     </w:p>
     <w:tbl>
       <w:tblPr>
-        <w:tblStyle w:val="TableGrid"/>
+        <w:tblStyle w:val="ae"/>
         <w:tblW w:w="0" w:type="auto"/>
         <w:tblLook w:val="04A0" w:firstRow="1" w:lastRow="0" w:firstColumn="1" w:lastColumn="0" w:noHBand="0" w:noVBand="1"/>
       </w:tblPr>
@@ -132,7 +132,7 @@
           <w:p>
             <w:pPr>
               <w:rPr>
-                <w:rFonts w:ascii="Times New Roman" w:hAnsi="Times New Roman" w:cs="Times New Roman"/>
+                <w:rFonts w:ascii="Times New Roman" w:hAnsi="Times New Roman" w:cs="Times New Roman" w:hint="eastAsia"/>
               </w:rPr>
             </w:pPr>
             <w:r>
@@ -141,6 +141,12 @@
               </w:rPr>
               <w:t xml:space="preserve">QM no: </w:t>
             </w:r>
+            <w:r>
+              <w:rPr>
+                <w:rFonts w:ascii="Times New Roman" w:hAnsi="Times New Roman" w:cs="Times New Roman" w:hint="eastAsia"/>
+              </w:rPr>
+              <w:t>231220127</w:t>
+            </w:r>
           </w:p>
         </w:tc>
         <w:tc>
@@ -164,6 +170,12 @@
                 <w:rFonts w:ascii="Times New Roman" w:hAnsi="Times New Roman" w:cs="Times New Roman"/>
               </w:rPr>
               <w:t xml:space="preserve"> </w:t>
+            </w:r>
+            <w:r>
+              <w:rPr>
+                <w:rFonts w:ascii="Times New Roman" w:hAnsi="Times New Roman" w:cs="Times New Roman"/>
+              </w:rPr>
+              <w:t>Bangzhen Wang</w:t>
             </w:r>
           </w:p>
         </w:tc>
@@ -203,6 +215,12 @@
               </w:rPr>
               <w:t xml:space="preserve">QM no: </w:t>
             </w:r>
+            <w:r>
+              <w:rPr>
+                <w:rFonts w:ascii="Times New Roman" w:hAnsi="Times New Roman" w:cs="Times New Roman"/>
+              </w:rPr>
+              <w:t>231220079</w:t>
+            </w:r>
           </w:p>
         </w:tc>
         <w:tc>
@@ -226,6 +244,12 @@
                 <w:rFonts w:ascii="Times New Roman" w:hAnsi="Times New Roman" w:cs="Times New Roman"/>
               </w:rPr>
               <w:t xml:space="preserve"> </w:t>
+            </w:r>
+            <w:r>
+              <w:rPr>
+                <w:rFonts w:ascii="Times New Roman" w:hAnsi="Times New Roman" w:cs="Times New Roman"/>
+              </w:rPr>
+              <w:t>Tengyi Liu</w:t>
             </w:r>
           </w:p>
         </w:tc>
@@ -256,7 +280,7 @@
           <w:p>
             <w:pPr>
               <w:rPr>
-                <w:rFonts w:ascii="Times New Roman" w:hAnsi="Times New Roman" w:cs="Times New Roman"/>
+                <w:rFonts w:ascii="Times New Roman" w:hAnsi="Times New Roman" w:cs="Times New Roman" w:hint="eastAsia"/>
               </w:rPr>
             </w:pPr>
             <w:r>
@@ -265,6 +289,12 @@
               </w:rPr>
               <w:t xml:space="preserve">QM no: </w:t>
             </w:r>
+            <w:r>
+              <w:rPr>
+                <w:rFonts w:ascii="Times New Roman" w:hAnsi="Times New Roman" w:cs="Times New Roman" w:hint="eastAsia"/>
+              </w:rPr>
+              <w:t>231220563</w:t>
+            </w:r>
           </w:p>
         </w:tc>
         <w:tc>
@@ -288,6 +318,12 @@
                 <w:rFonts w:ascii="Times New Roman" w:hAnsi="Times New Roman" w:cs="Times New Roman"/>
               </w:rPr>
               <w:t xml:space="preserve"> </w:t>
+            </w:r>
+            <w:r>
+              <w:rPr>
+                <w:rFonts w:ascii="Times New Roman" w:hAnsi="Times New Roman" w:cs="Times New Roman"/>
+              </w:rPr>
+              <w:t>Xiaojun Ouyang</w:t>
             </w:r>
           </w:p>
         </w:tc>
@@ -327,6 +363,12 @@
               </w:rPr>
               <w:t xml:space="preserve">QM no: </w:t>
             </w:r>
+            <w:r>
+              <w:rPr>
+                <w:rFonts w:ascii="Times New Roman" w:hAnsi="Times New Roman" w:cs="Times New Roman"/>
+              </w:rPr>
+              <w:t>231220091</w:t>
+            </w:r>
           </w:p>
         </w:tc>
         <w:tc>
@@ -350,6 +392,12 @@
                 <w:rFonts w:ascii="Times New Roman" w:hAnsi="Times New Roman" w:cs="Times New Roman"/>
               </w:rPr>
               <w:t xml:space="preserve"> </w:t>
+            </w:r>
+            <w:r>
+              <w:rPr>
+                <w:rFonts w:ascii="Times New Roman" w:hAnsi="Times New Roman" w:cs="Times New Roman"/>
+              </w:rPr>
+              <w:t>Yuhan Sheng</w:t>
             </w:r>
           </w:p>
         </w:tc>
@@ -389,6 +437,12 @@
               </w:rPr>
               <w:t xml:space="preserve">QM no: </w:t>
             </w:r>
+            <w:r>
+              <w:rPr>
+                <w:rFonts w:ascii="Times New Roman" w:hAnsi="Times New Roman" w:cs="Times New Roman"/>
+              </w:rPr>
+              <w:t>231220518</w:t>
+            </w:r>
           </w:p>
         </w:tc>
         <w:tc>
@@ -412,6 +466,12 @@
                 <w:rFonts w:ascii="Times New Roman" w:hAnsi="Times New Roman" w:cs="Times New Roman"/>
               </w:rPr>
               <w:t xml:space="preserve"> </w:t>
+            </w:r>
+            <w:r>
+              <w:rPr>
+                <w:rFonts w:ascii="Times New Roman" w:hAnsi="Times New Roman" w:cs="Times New Roman"/>
+              </w:rPr>
+              <w:t>Jialu Sun</w:t>
             </w:r>
           </w:p>
         </w:tc>
@@ -451,6 +511,12 @@
               </w:rPr>
               <w:t xml:space="preserve">QM no: </w:t>
             </w:r>
+            <w:r>
+              <w:rPr>
+                <w:rFonts w:ascii="Times New Roman" w:hAnsi="Times New Roman" w:cs="Times New Roman"/>
+              </w:rPr>
+              <w:t>231221065</w:t>
+            </w:r>
           </w:p>
         </w:tc>
         <w:tc>
@@ -474,6 +540,12 @@
                 <w:rFonts w:ascii="Times New Roman" w:hAnsi="Times New Roman" w:cs="Times New Roman"/>
               </w:rPr>
               <w:t xml:space="preserve"> </w:t>
+            </w:r>
+            <w:r>
+              <w:rPr>
+                <w:rFonts w:ascii="Times New Roman" w:hAnsi="Times New Roman" w:cs="Times New Roman"/>
+              </w:rPr>
+              <w:t>Bohan Zhou</w:t>
             </w:r>
           </w:p>
         </w:tc>
@@ -481,7 +553,7 @@
     </w:tbl>
     <w:p>
       <w:pPr>
-        <w:pStyle w:val="Heading1"/>
+        <w:pStyle w:val="1"/>
         <w:rPr>
           <w:rFonts w:ascii="Times New Roman" w:hAnsi="Times New Roman" w:cs="Times New Roman"/>
         </w:rPr>
@@ -501,7 +573,7 @@
     </w:p>
     <w:p>
       <w:pPr>
-        <w:pStyle w:val="Heading2"/>
+        <w:pStyle w:val="2"/>
         <w:numPr>
           <w:ilvl w:val="0"/>
           <w:numId w:val="1"/>
@@ -520,127 +592,2660 @@
     </w:p>
     <w:p>
       <w:pPr>
+        <w:pStyle w:val="2"/>
+        <w:spacing w:after="200"/>
+      </w:pPr>
+      <w:r>
+        <w:t>1.1 Project Overview</w:t>
+      </w:r>
+    </w:p>
+    <w:p>
+      <w:pPr>
+        <w:spacing w:after="120"/>
+      </w:pPr>
+      <w:r>
+        <w:t>This report documents the requirements engineering process for the BUPT International College Teaching Assistant (TA) Recruitment System. The system aims to facilitate the recruitment process between Teaching Assistants (TA) and Module Organizers (MO).</w:t>
+      </w:r>
+    </w:p>
+    <w:p>
+      <w:pPr>
+        <w:spacing w:after="200"/>
+      </w:pPr>
+      <w:r>
+        <w:t xml:space="preserve"> </w:t>
+      </w:r>
+      <w:r>
         <w:rPr>
-          <w:rFonts w:ascii="Times New Roman" w:hAnsi="Times New Roman" w:cs="Times New Roman"/>
+          <w:b/>
+          <w:bCs/>
         </w:rPr>
+        <w:t>System Users:</w:t>
+      </w:r>
+    </w:p>
+    <w:p>
+      <w:pPr>
+        <w:pStyle w:val="a9"/>
+        <w:numPr>
+          <w:ilvl w:val="0"/>
+          <w:numId w:val="3"/>
+        </w:numPr>
+        <w:spacing w:after="100" w:line="240" w:lineRule="auto"/>
+        <w:ind w:left="240"/>
+        <w:contextualSpacing w:val="0"/>
       </w:pPr>
       <w:r>
         <w:rPr>
-          <w:rFonts w:ascii="Times New Roman" w:hAnsi="Times New Roman" w:cs="Times New Roman"/>
+          <w:b/>
+          <w:bCs/>
         </w:rPr>
-        <w:t>D</w:t>
-      </w:r>
+        <w:t>Teaching Assistants (TA)</w:t>
+      </w:r>
+      <w:r>
+        <w:t>: Students seeking TA positions</w:t>
+      </w:r>
+    </w:p>
+    <w:p>
+      <w:pPr>
+        <w:pStyle w:val="a9"/>
+        <w:numPr>
+          <w:ilvl w:val="0"/>
+          <w:numId w:val="3"/>
+        </w:numPr>
+        <w:spacing w:after="100" w:line="240" w:lineRule="auto"/>
+        <w:ind w:left="240"/>
+        <w:contextualSpacing w:val="0"/>
+      </w:pPr>
       <w:r>
         <w:rPr>
-          <w:rFonts w:ascii="Times New Roman" w:hAnsi="Times New Roman" w:cs="Times New Roman"/>
+          <w:b/>
+          <w:bCs/>
         </w:rPr>
-        <w:t xml:space="preserve">escribe the fact-finding techniques, iteration </w:t>
-      </w:r>
+        <w:t>Module Organizers (MO)</w:t>
+      </w:r>
+      <w:r>
+        <w:t>: Faculty members who post TA positions and select candidates</w:t>
+      </w:r>
+    </w:p>
+    <w:p>
+      <w:pPr>
+        <w:pStyle w:val="a9"/>
+        <w:numPr>
+          <w:ilvl w:val="0"/>
+          <w:numId w:val="3"/>
+        </w:numPr>
+        <w:spacing w:after="100" w:line="240" w:lineRule="auto"/>
+        <w:ind w:left="240"/>
+        <w:contextualSpacing w:val="0"/>
+      </w:pPr>
       <w:r>
         <w:rPr>
-          <w:rFonts w:ascii="Times New Roman" w:hAnsi="Times New Roman" w:cs="Times New Roman"/>
+          <w:b/>
+          <w:bCs/>
         </w:rPr>
-        <w:t>plan</w:t>
-      </w:r>
+        <w:t>Administrator</w:t>
+      </w:r>
+      <w:r>
+        <w:t>: System administrator for workload statistics</w:t>
+      </w:r>
+    </w:p>
+    <w:p>
+      <w:pPr>
+        <w:pStyle w:val="3"/>
+      </w:pPr>
+      <w:r>
+        <w:t xml:space="preserve"> 1.2 Fact-Finding Techniques</w:t>
+      </w:r>
+    </w:p>
+    <w:p>
+      <w:pPr>
+        <w:spacing w:after="120"/>
+      </w:pPr>
+      <w:r>
+        <w:t>We employed multiple fact-finding techniques to gather comprehensive requirements:</w:t>
+      </w:r>
+    </w:p>
+    <w:p>
+      <w:pPr>
+        <w:pStyle w:val="4"/>
+      </w:pPr>
+      <w:r>
+        <w:t xml:space="preserve"> 1.2.1 Literature Review</w:t>
+      </w:r>
+    </w:p>
+    <w:p>
+      <w:pPr>
+        <w:pStyle w:val="a9"/>
+        <w:numPr>
+          <w:ilvl w:val="0"/>
+          <w:numId w:val="3"/>
+        </w:numPr>
+        <w:spacing w:after="100" w:line="240" w:lineRule="auto"/>
+        <w:ind w:left="240"/>
+        <w:contextualSpacing w:val="0"/>
+      </w:pPr>
+      <w:r>
+        <w:t>Analyzed similar TA recruitment systems at other universities</w:t>
+      </w:r>
+    </w:p>
+    <w:p>
+      <w:pPr>
+        <w:pStyle w:val="a9"/>
+        <w:numPr>
+          <w:ilvl w:val="0"/>
+          <w:numId w:val="3"/>
+        </w:numPr>
+        <w:spacing w:after="100" w:line="240" w:lineRule="auto"/>
+        <w:ind w:left="240"/>
+        <w:contextualSpacing w:val="0"/>
+      </w:pPr>
+      <w:r>
+        <w:t>Reviewed existing documentation and workflows</w:t>
+      </w:r>
+    </w:p>
+    <w:p>
+      <w:pPr>
+        <w:pStyle w:val="a9"/>
+        <w:numPr>
+          <w:ilvl w:val="0"/>
+          <w:numId w:val="3"/>
+        </w:numPr>
+        <w:spacing w:after="100" w:line="240" w:lineRule="auto"/>
+        <w:ind w:left="240"/>
+        <w:contextualSpacing w:val="0"/>
+      </w:pPr>
+      <w:r>
+        <w:t>Studied best practices for online recruitment platforms</w:t>
+      </w:r>
+    </w:p>
+    <w:p>
+      <w:pPr>
+        <w:pStyle w:val="4"/>
+      </w:pPr>
+      <w:r>
+        <w:t xml:space="preserve"> 1.2.2 User Interviews</w:t>
+      </w:r>
+    </w:p>
+    <w:p>
+      <w:pPr>
+        <w:pStyle w:val="a9"/>
+        <w:numPr>
+          <w:ilvl w:val="0"/>
+          <w:numId w:val="3"/>
+        </w:numPr>
+        <w:spacing w:after="100" w:line="240" w:lineRule="auto"/>
+        <w:ind w:left="240"/>
+        <w:contextualSpacing w:val="0"/>
+      </w:pPr>
+      <w:r>
+        <w:t>Conducted interviews with potential TAs to understand their needs</w:t>
+      </w:r>
+    </w:p>
+    <w:p>
+      <w:pPr>
+        <w:pStyle w:val="a9"/>
+        <w:numPr>
+          <w:ilvl w:val="0"/>
+          <w:numId w:val="3"/>
+        </w:numPr>
+        <w:spacing w:after="100" w:line="240" w:lineRule="auto"/>
+        <w:ind w:left="240"/>
+        <w:contextualSpacing w:val="0"/>
+      </w:pPr>
+      <w:r>
+        <w:t>Interviewed Module Organizers regarding their hiring criteria</w:t>
+      </w:r>
+    </w:p>
+    <w:p>
+      <w:pPr>
+        <w:pStyle w:val="a9"/>
+        <w:numPr>
+          <w:ilvl w:val="0"/>
+          <w:numId w:val="3"/>
+        </w:numPr>
+        <w:spacing w:after="100" w:line="240" w:lineRule="auto"/>
+        <w:ind w:left="240"/>
+        <w:contextualSpacing w:val="0"/>
+      </w:pPr>
+      <w:r>
+        <w:t>Gathered requirements for resume handling, skill matching, and application tracking</w:t>
+      </w:r>
+    </w:p>
+    <w:p>
+      <w:pPr>
+        <w:pStyle w:val="4"/>
+      </w:pPr>
+      <w:r>
+        <w:t xml:space="preserve"> 1.2.3 Observation</w:t>
+      </w:r>
+    </w:p>
+    <w:p>
+      <w:pPr>
+        <w:pStyle w:val="a9"/>
+        <w:numPr>
+          <w:ilvl w:val="0"/>
+          <w:numId w:val="3"/>
+        </w:numPr>
+        <w:spacing w:after="100" w:line="240" w:lineRule="auto"/>
+        <w:ind w:left="240"/>
+        <w:contextualSpacing w:val="0"/>
+      </w:pPr>
+      <w:r>
+        <w:t>Observed current manual recruitment processes</w:t>
+      </w:r>
+    </w:p>
+    <w:p>
+      <w:pPr>
+        <w:pStyle w:val="a9"/>
+        <w:numPr>
+          <w:ilvl w:val="0"/>
+          <w:numId w:val="3"/>
+        </w:numPr>
+        <w:spacing w:after="100" w:line="240" w:lineRule="auto"/>
+        <w:ind w:left="240"/>
+        <w:contextualSpacing w:val="0"/>
+      </w:pPr>
+      <w:r>
+        <w:lastRenderedPageBreak/>
+        <w:t>Identified pain points in the existing workflow</w:t>
+      </w:r>
+    </w:p>
+    <w:p>
+      <w:pPr>
+        <w:pStyle w:val="a9"/>
+        <w:numPr>
+          <w:ilvl w:val="0"/>
+          <w:numId w:val="3"/>
+        </w:numPr>
+        <w:spacing w:after="100" w:line="240" w:lineRule="auto"/>
+        <w:ind w:left="240"/>
+        <w:contextualSpacing w:val="0"/>
+      </w:pPr>
+      <w:r>
+        <w:t>Documented time-consuming tasks that could be automated</w:t>
+      </w:r>
+    </w:p>
+    <w:p>
+      <w:pPr>
+        <w:pStyle w:val="4"/>
+      </w:pPr>
+      <w:r>
+        <w:t xml:space="preserve"> 1.2.4 Prototyping</w:t>
+      </w:r>
+    </w:p>
+    <w:p>
+      <w:pPr>
+        <w:pStyle w:val="a9"/>
+        <w:numPr>
+          <w:ilvl w:val="0"/>
+          <w:numId w:val="3"/>
+        </w:numPr>
+        <w:spacing w:after="100" w:line="240" w:lineRule="auto"/>
+        <w:ind w:left="240"/>
+        <w:contextualSpacing w:val="0"/>
+      </w:pPr>
+      <w:r>
+        <w:t>Created low-fidelity prototypes to validate user requirements</w:t>
+      </w:r>
+    </w:p>
+    <w:p>
+      <w:pPr>
+        <w:pStyle w:val="a9"/>
+        <w:numPr>
+          <w:ilvl w:val="0"/>
+          <w:numId w:val="3"/>
+        </w:numPr>
+        <w:spacing w:after="100" w:line="240" w:lineRule="auto"/>
+        <w:ind w:left="240"/>
+        <w:contextualSpacing w:val="0"/>
+      </w:pPr>
+      <w:r>
+        <w:t>Used iterative feedback to refine system design</w:t>
+      </w:r>
+    </w:p>
+    <w:p>
+      <w:pPr>
+        <w:pStyle w:val="a9"/>
+        <w:numPr>
+          <w:ilvl w:val="0"/>
+          <w:numId w:val="3"/>
+        </w:numPr>
+        <w:spacing w:after="100" w:line="240" w:lineRule="auto"/>
+        <w:ind w:left="240"/>
+        <w:contextualSpacing w:val="0"/>
+      </w:pPr>
+      <w:r>
+        <w:t>Ensured prototypes aligned with user expectations</w:t>
+      </w:r>
+    </w:p>
+    <w:p>
+      <w:pPr>
+        <w:pStyle w:val="3"/>
+      </w:pPr>
+      <w:r>
+        <w:t xml:space="preserve"> 1.3 Iteration Planning</w:t>
+      </w:r>
+    </w:p>
+    <w:p>
+      <w:pPr>
+        <w:spacing w:after="120"/>
+      </w:pPr>
+      <w:r>
+        <w:t xml:space="preserve">We adopted an iterative development approach with 4 sprints distributed across three assessment phases: </w:t>
+      </w:r>
+    </w:p>
+    <w:p>
+      <w:pPr>
+        <w:pStyle w:val="3"/>
+        <w:spacing w:after="200"/>
+      </w:pPr>
+      <w:r>
+        <w:t>Sprint Distribution</w:t>
+      </w:r>
+    </w:p>
+    <w:tbl>
+      <w:tblPr>
+        <w:tblW w:w="5000" w:type="pct"/>
+        <w:tblBorders>
+          <w:top w:val="single" w:sz="4" w:space="0" w:color="auto"/>
+          <w:left w:val="single" w:sz="4" w:space="0" w:color="auto"/>
+          <w:bottom w:val="single" w:sz="4" w:space="0" w:color="auto"/>
+          <w:right w:val="single" w:sz="4" w:space="0" w:color="auto"/>
+          <w:insideH w:val="single" w:sz="4" w:space="0" w:color="auto"/>
+          <w:insideV w:val="single" w:sz="4" w:space="0" w:color="auto"/>
+        </w:tblBorders>
+        <w:tblLayout w:type="fixed"/>
+        <w:tblCellMar>
+          <w:top w:w="80" w:type="dxa"/>
+          <w:left w:w="120" w:type="dxa"/>
+          <w:bottom w:w="80" w:type="dxa"/>
+          <w:right w:w="120" w:type="dxa"/>
+        </w:tblCellMar>
+        <w:tblLook w:val="0000" w:firstRow="0" w:lastRow="0" w:firstColumn="0" w:lastColumn="0" w:noHBand="0" w:noVBand="0"/>
+      </w:tblPr>
+      <w:tblGrid>
+        <w:gridCol w:w="1389"/>
+        <w:gridCol w:w="1275"/>
+        <w:gridCol w:w="1390"/>
+        <w:gridCol w:w="1849"/>
+        <w:gridCol w:w="3113"/>
+      </w:tblGrid>
+      <w:tr>
+        <w:trPr>
+          <w:tblHeader/>
+        </w:trPr>
+        <w:tc>
+          <w:tcPr>
+            <w:tcW w:w="1440" w:type="dxa"/>
+          </w:tcPr>
+          <w:p>
+            <w:r>
+              <w:rPr>
+                <w:b/>
+                <w:bCs/>
+              </w:rPr>
+              <w:t>Sprint</w:t>
+            </w:r>
+          </w:p>
+        </w:tc>
+        <w:tc>
+          <w:tcPr>
+            <w:tcW w:w="1320" w:type="dxa"/>
+          </w:tcPr>
+          <w:p>
+            <w:r>
+              <w:rPr>
+                <w:b/>
+                <w:bCs/>
+              </w:rPr>
+              <w:t>Phase</w:t>
+            </w:r>
+          </w:p>
+        </w:tc>
+        <w:tc>
+          <w:tcPr>
+            <w:tcW w:w="1440" w:type="dxa"/>
+          </w:tcPr>
+          <w:p>
+            <w:r>
+              <w:rPr>
+                <w:b/>
+                <w:bCs/>
+              </w:rPr>
+              <w:t>Duration</w:t>
+            </w:r>
+          </w:p>
+        </w:tc>
+        <w:tc>
+          <w:tcPr>
+            <w:tcW w:w="1920" w:type="dxa"/>
+          </w:tcPr>
+          <w:p>
+            <w:r>
+              <w:rPr>
+                <w:b/>
+                <w:bCs/>
+              </w:rPr>
+              <w:t>Focus</w:t>
+            </w:r>
+          </w:p>
+        </w:tc>
+        <w:tc>
+          <w:tcPr>
+            <w:tcW w:w="3240" w:type="dxa"/>
+          </w:tcPr>
+          <w:p>
+            <w:r>
+              <w:rPr>
+                <w:b/>
+                <w:bCs/>
+              </w:rPr>
+              <w:t>Key Deliverables</w:t>
+            </w:r>
+          </w:p>
+        </w:tc>
+      </w:tr>
+      <w:tr>
+        <w:tc>
+          <w:tcPr>
+            <w:tcW w:w="1440" w:type="dxa"/>
+          </w:tcPr>
+          <w:p>
+            <w:r>
+              <w:t>Sprint 1</w:t>
+            </w:r>
+          </w:p>
+        </w:tc>
+        <w:tc>
+          <w:tcPr>
+            <w:tcW w:w="1320" w:type="dxa"/>
+          </w:tcPr>
+          <w:p>
+            <w:r>
+              <w:t>Phase 1</w:t>
+            </w:r>
+          </w:p>
+        </w:tc>
+        <w:tc>
+          <w:tcPr>
+            <w:tcW w:w="1440" w:type="dxa"/>
+          </w:tcPr>
+          <w:p>
+            <w:r>
+              <w:t>Week 1-3</w:t>
+            </w:r>
+          </w:p>
+        </w:tc>
+        <w:tc>
+          <w:tcPr>
+            <w:tcW w:w="1920" w:type="dxa"/>
+          </w:tcPr>
+          <w:p>
+            <w:r>
+              <w:t>Documentation</w:t>
+            </w:r>
+          </w:p>
+        </w:tc>
+        <w:tc>
+          <w:tcPr>
+            <w:tcW w:w="3240" w:type="dxa"/>
+          </w:tcPr>
+          <w:p>
+            <w:r>
+              <w:t>User Stories, Prototypes, Report</w:t>
+            </w:r>
+          </w:p>
+        </w:tc>
+      </w:tr>
+      <w:tr>
+        <w:tc>
+          <w:tcPr>
+            <w:tcW w:w="1440" w:type="dxa"/>
+          </w:tcPr>
+          <w:p>
+            <w:r>
+              <w:t>Sprint 2</w:t>
+            </w:r>
+          </w:p>
+        </w:tc>
+        <w:tc>
+          <w:tcPr>
+            <w:tcW w:w="1320" w:type="dxa"/>
+          </w:tcPr>
+          <w:p>
+            <w:r>
+              <w:t>Phase 2</w:t>
+            </w:r>
+          </w:p>
+        </w:tc>
+        <w:tc>
+          <w:tcPr>
+            <w:tcW w:w="1440" w:type="dxa"/>
+          </w:tcPr>
+          <w:p>
+            <w:r>
+              <w:t>Week 4-6</w:t>
+            </w:r>
+          </w:p>
+        </w:tc>
+        <w:tc>
+          <w:tcPr>
+            <w:tcW w:w="1920" w:type="dxa"/>
+          </w:tcPr>
+          <w:p>
+            <w:r>
+              <w:t>Core Development</w:t>
+            </w:r>
+          </w:p>
+        </w:tc>
+        <w:tc>
+          <w:tcPr>
+            <w:tcW w:w="3240" w:type="dxa"/>
+          </w:tcPr>
+          <w:p>
+            <w:r>
+              <w:t>Authentication, Profile, Jobs, Applications</w:t>
+            </w:r>
+          </w:p>
+        </w:tc>
+      </w:tr>
+      <w:tr>
+        <w:tc>
+          <w:tcPr>
+            <w:tcW w:w="1440" w:type="dxa"/>
+          </w:tcPr>
+          <w:p>
+            <w:r>
+              <w:t>Sprint 3</w:t>
+            </w:r>
+          </w:p>
+        </w:tc>
+        <w:tc>
+          <w:tcPr>
+            <w:tcW w:w="1320" w:type="dxa"/>
+          </w:tcPr>
+          <w:p>
+            <w:r>
+              <w:t>Phase 3</w:t>
+            </w:r>
+          </w:p>
+        </w:tc>
+        <w:tc>
+          <w:tcPr>
+            <w:tcW w:w="1440" w:type="dxa"/>
+          </w:tcPr>
+          <w:p>
+            <w:r>
+              <w:t>Week 7-8</w:t>
+            </w:r>
+          </w:p>
+        </w:tc>
+        <w:tc>
+          <w:tcPr>
+            <w:tcW w:w="1920" w:type="dxa"/>
+          </w:tcPr>
+          <w:p>
+            <w:r>
+              <w:t>AI Features</w:t>
+            </w:r>
+          </w:p>
+        </w:tc>
+        <w:tc>
+          <w:tcPr>
+            <w:tcW w:w="3240" w:type="dxa"/>
+          </w:tcPr>
+          <w:p>
+            <w:r>
+              <w:t>Skill Matching, Missing Skills Detection</w:t>
+            </w:r>
+          </w:p>
+        </w:tc>
+      </w:tr>
+      <w:tr>
+        <w:tc>
+          <w:tcPr>
+            <w:tcW w:w="1440" w:type="dxa"/>
+          </w:tcPr>
+          <w:p>
+            <w:r>
+              <w:t>Sprint 4</w:t>
+            </w:r>
+          </w:p>
+        </w:tc>
+        <w:tc>
+          <w:tcPr>
+            <w:tcW w:w="1320" w:type="dxa"/>
+          </w:tcPr>
+          <w:p>
+            <w:r>
+              <w:t>Phase 3</w:t>
+            </w:r>
+          </w:p>
+        </w:tc>
+        <w:tc>
+          <w:tcPr>
+            <w:tcW w:w="1440" w:type="dxa"/>
+          </w:tcPr>
+          <w:p>
+            <w:r>
+              <w:t>Week 9-10</w:t>
+            </w:r>
+          </w:p>
+        </w:tc>
+        <w:tc>
+          <w:tcPr>
+            <w:tcW w:w="1920" w:type="dxa"/>
+          </w:tcPr>
+          <w:p>
+            <w:r>
+              <w:t>Optimization</w:t>
+            </w:r>
+          </w:p>
+        </w:tc>
+        <w:tc>
+          <w:tcPr>
+            <w:tcW w:w="3240" w:type="dxa"/>
+          </w:tcPr>
+          <w:p>
+            <w:r>
+              <w:t>Performance, Notifications, Manual</w:t>
+            </w:r>
+          </w:p>
+        </w:tc>
+      </w:tr>
+    </w:tbl>
+    <w:p>
+      <w:pPr>
+        <w:pStyle w:val="3"/>
+        <w:spacing w:after="200"/>
+      </w:pPr>
+      <w:r>
+        <w:t>Iteration Details</w:t>
+      </w:r>
+    </w:p>
+    <w:p>
+      <w:pPr>
+        <w:spacing w:after="120"/>
+      </w:pPr>
       <w:r>
         <w:rPr>
-          <w:rFonts w:ascii="Times New Roman" w:hAnsi="Times New Roman" w:cs="Times New Roman"/>
+          <w:b/>
+          <w:bCs/>
         </w:rPr>
-        <w:t>, prioriti</w:t>
-      </w:r>
+        <w:t>Sprint 1 (Current - Phase 1):</w:t>
+      </w:r>
+    </w:p>
+    <w:p>
+      <w:pPr>
+        <w:pStyle w:val="a9"/>
+        <w:numPr>
+          <w:ilvl w:val="0"/>
+          <w:numId w:val="3"/>
+        </w:numPr>
+        <w:spacing w:after="100" w:line="240" w:lineRule="auto"/>
+        <w:ind w:left="240"/>
+        <w:contextualSpacing w:val="0"/>
+      </w:pPr>
+      <w:r>
+        <w:t>Duration: 3 weeks (Mar 6-21)</w:t>
+      </w:r>
+    </w:p>
+    <w:p>
+      <w:pPr>
+        <w:pStyle w:val="a9"/>
+        <w:numPr>
+          <w:ilvl w:val="0"/>
+          <w:numId w:val="3"/>
+        </w:numPr>
+        <w:spacing w:after="100" w:line="240" w:lineRule="auto"/>
+        <w:ind w:left="240"/>
+        <w:contextualSpacing w:val="0"/>
+      </w:pPr>
+      <w:r>
+        <w:t>Goal: Complete all documentation for first assessment</w:t>
+      </w:r>
+    </w:p>
+    <w:p>
+      <w:pPr>
+        <w:pStyle w:val="a9"/>
+        <w:numPr>
+          <w:ilvl w:val="0"/>
+          <w:numId w:val="3"/>
+        </w:numPr>
+        <w:spacing w:after="100" w:line="240" w:lineRule="auto"/>
+        <w:ind w:left="240"/>
+        <w:contextualSpacing w:val="0"/>
+      </w:pPr>
+      <w:r>
+        <w:t>Deliverables: Product Backlog, Prototypes, Report</w:t>
+      </w:r>
+    </w:p>
+    <w:p>
+      <w:pPr>
+        <w:spacing w:after="200"/>
+      </w:pPr>
+      <w:r>
+        <w:t xml:space="preserve"> </w:t>
+      </w:r>
+    </w:p>
+    <w:p>
+      <w:pPr>
+        <w:spacing w:after="120"/>
+      </w:pPr>
       <w:r>
         <w:rPr>
-          <w:rFonts w:ascii="Times New Roman" w:hAnsi="Times New Roman" w:cs="Times New Roman"/>
+          <w:b/>
+          <w:bCs/>
         </w:rPr>
-        <w:t>s</w:t>
-      </w:r>
+        <w:t>Sprint 2 (Phase 2):</w:t>
+      </w:r>
+    </w:p>
+    <w:p>
+      <w:pPr>
+        <w:pStyle w:val="a9"/>
+        <w:numPr>
+          <w:ilvl w:val="0"/>
+          <w:numId w:val="3"/>
+        </w:numPr>
+        <w:spacing w:after="100" w:line="240" w:lineRule="auto"/>
+        <w:ind w:left="240"/>
+        <w:contextualSpacing w:val="0"/>
+      </w:pPr>
+      <w:r>
+        <w:t>Duration: 3 weeks (Mar 23 - Apr 11)</w:t>
+      </w:r>
+    </w:p>
+    <w:p>
+      <w:pPr>
+        <w:pStyle w:val="a9"/>
+        <w:numPr>
+          <w:ilvl w:val="0"/>
+          <w:numId w:val="3"/>
+        </w:numPr>
+        <w:spacing w:after="100" w:line="240" w:lineRule="auto"/>
+        <w:ind w:left="240"/>
+        <w:contextualSpacing w:val="0"/>
+      </w:pPr>
+      <w:r>
+        <w:t>Goal: Implement core MVP features</w:t>
+      </w:r>
+    </w:p>
+    <w:p>
+      <w:pPr>
+        <w:pStyle w:val="a9"/>
+        <w:numPr>
+          <w:ilvl w:val="0"/>
+          <w:numId w:val="3"/>
+        </w:numPr>
+        <w:spacing w:after="100" w:line="240" w:lineRule="auto"/>
+        <w:ind w:left="240"/>
+        <w:contextualSpacing w:val="0"/>
+      </w:pPr>
+      <w:r>
+        <w:t>Focus: User authentication, profile management, job posting, application system</w:t>
+      </w:r>
+    </w:p>
+    <w:p>
+      <w:pPr>
+        <w:spacing w:after="200"/>
+      </w:pPr>
+      <w:r>
+        <w:t xml:space="preserve"> </w:t>
+      </w:r>
+    </w:p>
+    <w:p>
+      <w:pPr>
+        <w:spacing w:after="120"/>
+      </w:pPr>
       <w:r>
         <w:rPr>
-          <w:rFonts w:ascii="Times New Roman" w:hAnsi="Times New Roman" w:cs="Times New Roman"/>
+          <w:b/>
+          <w:bCs/>
         </w:rPr>
-        <w:t xml:space="preserve">ation and estimation </w:t>
-      </w:r>
+        <w:lastRenderedPageBreak/>
+        <w:t>Sprint 3 (Phase 3):</w:t>
+      </w:r>
+    </w:p>
+    <w:p>
+      <w:pPr>
+        <w:pStyle w:val="a9"/>
+        <w:numPr>
+          <w:ilvl w:val="0"/>
+          <w:numId w:val="3"/>
+        </w:numPr>
+        <w:spacing w:after="100" w:line="240" w:lineRule="auto"/>
+        <w:ind w:left="240"/>
+        <w:contextualSpacing w:val="0"/>
+      </w:pPr>
+      <w:r>
+        <w:t>Duration: 2 weeks (Apr 13-26)</w:t>
+      </w:r>
+    </w:p>
+    <w:p>
+      <w:pPr>
+        <w:pStyle w:val="a9"/>
+        <w:numPr>
+          <w:ilvl w:val="0"/>
+          <w:numId w:val="3"/>
+        </w:numPr>
+        <w:spacing w:after="100" w:line="240" w:lineRule="auto"/>
+        <w:ind w:left="240"/>
+        <w:contextualSpacing w:val="0"/>
+      </w:pPr>
+      <w:r>
+        <w:t>Goal: Add AI-powered features</w:t>
+      </w:r>
+    </w:p>
+    <w:p>
+      <w:pPr>
+        <w:pStyle w:val="a9"/>
+        <w:numPr>
+          <w:ilvl w:val="0"/>
+          <w:numId w:val="3"/>
+        </w:numPr>
+        <w:spacing w:after="100" w:line="240" w:lineRule="auto"/>
+        <w:ind w:left="240"/>
+        <w:contextualSpacing w:val="0"/>
+      </w:pPr>
+      <w:r>
+        <w:t>Focus: Skill matching algorithm, missing skills detection</w:t>
+      </w:r>
+    </w:p>
+    <w:p>
+      <w:pPr>
+        <w:spacing w:after="200"/>
+      </w:pPr>
+      <w:r>
+        <w:t xml:space="preserve"> </w:t>
+      </w:r>
+    </w:p>
+    <w:p>
+      <w:pPr>
+        <w:spacing w:after="120"/>
+      </w:pPr>
       <w:r>
         <w:rPr>
-          <w:rFonts w:ascii="Times New Roman" w:hAnsi="Times New Roman" w:cs="Times New Roman"/>
+          <w:b/>
+          <w:bCs/>
         </w:rPr>
-        <w:t>methods</w:t>
+        <w:t>Sprint 4 (Phase 3):</w:t>
+      </w:r>
+    </w:p>
+    <w:p>
+      <w:pPr>
+        <w:pStyle w:val="a9"/>
+        <w:numPr>
+          <w:ilvl w:val="0"/>
+          <w:numId w:val="3"/>
+        </w:numPr>
+        <w:spacing w:after="100" w:line="240" w:lineRule="auto"/>
+        <w:ind w:left="240"/>
+        <w:contextualSpacing w:val="0"/>
+      </w:pPr>
+      <w:r>
+        <w:t>Duration: 2 weeks (Apr 27 - May 10)</w:t>
+      </w:r>
+    </w:p>
+    <w:p>
+      <w:pPr>
+        <w:pStyle w:val="a9"/>
+        <w:numPr>
+          <w:ilvl w:val="0"/>
+          <w:numId w:val="3"/>
+        </w:numPr>
+        <w:spacing w:after="100" w:line="240" w:lineRule="auto"/>
+        <w:ind w:left="240"/>
+        <w:contextualSpacing w:val="0"/>
+      </w:pPr>
+      <w:r>
+        <w:t>Goal: Performance optimization and final improvements</w:t>
+      </w:r>
+    </w:p>
+    <w:p>
+      <w:pPr>
+        <w:pStyle w:val="a9"/>
+        <w:numPr>
+          <w:ilvl w:val="0"/>
+          <w:numId w:val="3"/>
+        </w:numPr>
+        <w:spacing w:after="100" w:line="240" w:lineRule="auto"/>
+        <w:ind w:left="240"/>
+        <w:contextualSpacing w:val="0"/>
+      </w:pPr>
+      <w:r>
+        <w:t>Focus: System optimization, user manual, testing</w:t>
+      </w:r>
+    </w:p>
+    <w:p>
+      <w:pPr>
+        <w:spacing w:after="200"/>
+      </w:pPr>
+      <w:r>
+        <w:t xml:space="preserve"> </w:t>
+      </w:r>
+    </w:p>
+    <w:p>
+      <w:pPr>
+        <w:pBdr>
+          <w:bottom w:val="single" w:sz="6" w:space="1" w:color="auto"/>
+        </w:pBdr>
+        <w:spacing w:after="120"/>
+      </w:pPr>
+    </w:p>
+    <w:p>
+      <w:pPr>
+        <w:spacing w:after="200"/>
+      </w:pPr>
+      <w:r>
+        <w:t xml:space="preserve"> </w:t>
+      </w:r>
+    </w:p>
+    <w:p>
+      <w:pPr>
+        <w:pStyle w:val="2"/>
+        <w:spacing w:after="200"/>
+      </w:pPr>
+      <w:r>
+        <w:t>1.4 Prioritisation Methods</w:t>
+      </w:r>
+    </w:p>
+    <w:p>
+      <w:pPr>
+        <w:spacing w:after="120"/>
+      </w:pPr>
+      <w:r>
+        <w:t>We used the MoSCoW method combined with story point prioritization:</w:t>
+      </w:r>
+    </w:p>
+    <w:p>
+      <w:pPr>
+        <w:spacing w:after="200"/>
+      </w:pPr>
+      <w:r>
+        <w:t xml:space="preserve"> </w:t>
+      </w:r>
+    </w:p>
+    <w:p>
+      <w:pPr>
+        <w:pStyle w:val="3"/>
+        <w:spacing w:after="200"/>
+      </w:pPr>
+      <w:r>
+        <w:t>MoSCoW Prioritisation</w:t>
+      </w:r>
+    </w:p>
+    <w:tbl>
+      <w:tblPr>
+        <w:tblW w:w="5000" w:type="pct"/>
+        <w:tblBorders>
+          <w:top w:val="single" w:sz="4" w:space="0" w:color="auto"/>
+          <w:left w:val="single" w:sz="4" w:space="0" w:color="auto"/>
+          <w:bottom w:val="single" w:sz="4" w:space="0" w:color="auto"/>
+          <w:right w:val="single" w:sz="4" w:space="0" w:color="auto"/>
+          <w:insideH w:val="single" w:sz="4" w:space="0" w:color="auto"/>
+          <w:insideV w:val="single" w:sz="4" w:space="0" w:color="auto"/>
+        </w:tblBorders>
+        <w:tblLayout w:type="fixed"/>
+        <w:tblCellMar>
+          <w:top w:w="80" w:type="dxa"/>
+          <w:left w:w="120" w:type="dxa"/>
+          <w:bottom w:w="80" w:type="dxa"/>
+          <w:right w:w="120" w:type="dxa"/>
+        </w:tblCellMar>
+        <w:tblLook w:val="0000" w:firstRow="0" w:lastRow="0" w:firstColumn="0" w:lastColumn="0" w:noHBand="0" w:noVBand="0"/>
+      </w:tblPr>
+      <w:tblGrid>
+        <w:gridCol w:w="2406"/>
+        <w:gridCol w:w="3155"/>
+        <w:gridCol w:w="3455"/>
+      </w:tblGrid>
+      <w:tr>
+        <w:trPr>
+          <w:tblHeader/>
+        </w:trPr>
+        <w:tc>
+          <w:tcPr>
+            <w:tcW w:w="2496" w:type="dxa"/>
+          </w:tcPr>
+          <w:p>
+            <w:r>
+              <w:rPr>
+                <w:b/>
+                <w:bCs/>
+              </w:rPr>
+              <w:t>Priority</w:t>
+            </w:r>
+          </w:p>
+        </w:tc>
+        <w:tc>
+          <w:tcPr>
+            <w:tcW w:w="3276" w:type="dxa"/>
+          </w:tcPr>
+          <w:p>
+            <w:r>
+              <w:rPr>
+                <w:b/>
+                <w:bCs/>
+              </w:rPr>
+              <w:t>Meaning</w:t>
+            </w:r>
+          </w:p>
+        </w:tc>
+        <w:tc>
+          <w:tcPr>
+            <w:tcW w:w="3588" w:type="dxa"/>
+          </w:tcPr>
+          <w:p>
+            <w:r>
+              <w:rPr>
+                <w:b/>
+                <w:bCs/>
+              </w:rPr>
+              <w:t>User Stories</w:t>
+            </w:r>
+          </w:p>
+        </w:tc>
+      </w:tr>
+      <w:tr>
+        <w:tc>
+          <w:tcPr>
+            <w:tcW w:w="2496" w:type="dxa"/>
+          </w:tcPr>
+          <w:p>
+            <w:r>
+              <w:rPr>
+                <w:b/>
+                <w:bCs/>
+              </w:rPr>
+              <w:t>Must Have</w:t>
+            </w:r>
+          </w:p>
+        </w:tc>
+        <w:tc>
+          <w:tcPr>
+            <w:tcW w:w="3276" w:type="dxa"/>
+          </w:tcPr>
+          <w:p>
+            <w:r>
+              <w:t>Critical for MVP</w:t>
+            </w:r>
+          </w:p>
+        </w:tc>
+        <w:tc>
+          <w:tcPr>
+            <w:tcW w:w="3588" w:type="dxa"/>
+          </w:tcPr>
+          <w:p>
+            <w:r>
+              <w:t>US001-US005, US007-US013</w:t>
+            </w:r>
+          </w:p>
+        </w:tc>
+      </w:tr>
+      <w:tr>
+        <w:tc>
+          <w:tcPr>
+            <w:tcW w:w="2496" w:type="dxa"/>
+          </w:tcPr>
+          <w:p>
+            <w:r>
+              <w:rPr>
+                <w:b/>
+                <w:bCs/>
+              </w:rPr>
+              <w:t>Should Have</w:t>
+            </w:r>
+          </w:p>
+        </w:tc>
+        <w:tc>
+          <w:tcPr>
+            <w:tcW w:w="3276" w:type="dxa"/>
+          </w:tcPr>
+          <w:p>
+            <w:r>
+              <w:t>Important but not critical</w:t>
+            </w:r>
+          </w:p>
+        </w:tc>
+        <w:tc>
+          <w:tcPr>
+            <w:tcW w:w="3588" w:type="dxa"/>
+          </w:tcPr>
+          <w:p>
+            <w:r>
+              <w:t>US006, US009, US015, US019</w:t>
+            </w:r>
+          </w:p>
+        </w:tc>
+      </w:tr>
+      <w:tr>
+        <w:tc>
+          <w:tcPr>
+            <w:tcW w:w="2496" w:type="dxa"/>
+          </w:tcPr>
+          <w:p>
+            <w:r>
+              <w:rPr>
+                <w:b/>
+                <w:bCs/>
+              </w:rPr>
+              <w:t>Could Have</w:t>
+            </w:r>
+          </w:p>
+        </w:tc>
+        <w:tc>
+          <w:tcPr>
+            <w:tcW w:w="3276" w:type="dxa"/>
+          </w:tcPr>
+          <w:p>
+            <w:r>
+              <w:t>Nice to have</w:t>
+            </w:r>
+          </w:p>
+        </w:tc>
+        <w:tc>
+          <w:tcPr>
+            <w:tcW w:w="3588" w:type="dxa"/>
+          </w:tcPr>
+          <w:p>
+            <w:r>
+              <w:t>US016-US018, US020-US021</w:t>
+            </w:r>
+          </w:p>
+        </w:tc>
+      </w:tr>
+      <w:tr>
+        <w:tc>
+          <w:tcPr>
+            <w:tcW w:w="2496" w:type="dxa"/>
+          </w:tcPr>
+          <w:p>
+            <w:r>
+              <w:rPr>
+                <w:b/>
+                <w:bCs/>
+              </w:rPr>
+              <w:t>Won't Have</w:t>
+            </w:r>
+          </w:p>
+        </w:tc>
+        <w:tc>
+          <w:tcPr>
+            <w:tcW w:w="3276" w:type="dxa"/>
+          </w:tcPr>
+          <w:p>
+            <w:r>
+              <w:t>Not in current scope</w:t>
+            </w:r>
+          </w:p>
+        </w:tc>
+        <w:tc>
+          <w:tcPr>
+            <w:tcW w:w="3588" w:type="dxa"/>
+          </w:tcPr>
+          <w:p>
+            <w:r>
+              <w:t>US022 (deferred to optimization)</w:t>
+            </w:r>
+          </w:p>
+        </w:tc>
+      </w:tr>
+    </w:tbl>
+    <w:p>
+      <w:pPr>
+        <w:pStyle w:val="3"/>
+        <w:spacing w:after="200"/>
+      </w:pPr>
+      <w:r>
+        <w:t>Prioritisation Criteria</w:t>
+      </w:r>
+    </w:p>
+    <w:p>
+      <w:pPr>
+        <w:spacing w:after="100"/>
+        <w:ind w:left="240"/>
+      </w:pPr>
+      <w:r>
+        <w:t xml:space="preserve">1. </w:t>
       </w:r>
       <w:r>
         <w:rPr>
-          <w:rFonts w:ascii="Times New Roman" w:hAnsi="Times New Roman" w:cs="Times New Roman"/>
+          <w:b/>
+          <w:bCs/>
         </w:rPr>
-        <w:t xml:space="preserve"> used in the project</w:t>
+        <w:t>Business Value</w:t>
+      </w:r>
+      <w:r>
+        <w:t>: How much value does the feature add to users?</w:t>
+      </w:r>
+    </w:p>
+    <w:p>
+      <w:pPr>
+        <w:spacing w:after="100"/>
+        <w:ind w:left="240"/>
+      </w:pPr>
+      <w:r>
+        <w:t xml:space="preserve">2. </w:t>
       </w:r>
       <w:r>
         <w:rPr>
-          <w:rFonts w:ascii="Times New Roman" w:hAnsi="Times New Roman" w:cs="Times New Roman"/>
+          <w:b/>
+          <w:bCs/>
         </w:rPr>
-        <w:t>.</w:t>
-      </w:r>
-    </w:p>
-    <w:p>
-      <w:pPr>
+        <w:t>Dependency</w:t>
+      </w:r>
+      <w:r>
+        <w:t>: Does the feature depend on others?</w:t>
+      </w:r>
+    </w:p>
+    <w:p>
+      <w:pPr>
+        <w:spacing w:after="100"/>
+        <w:ind w:left="240"/>
+      </w:pPr>
+      <w:r>
+        <w:t xml:space="preserve">3. </w:t>
+      </w:r>
+      <w:r>
         <w:rPr>
-          <w:rFonts w:ascii="Times New Roman" w:hAnsi="Times New Roman" w:cs="Times New Roman"/>
-          <w:color w:val="FF0000"/>
+          <w:b/>
+          <w:bCs/>
         </w:rPr>
-      </w:pPr>
+        <w:t>Risk</w:t>
+      </w:r>
+      <w:r>
+        <w:t>: What is the technical risk involved?</w:t>
+      </w:r>
+    </w:p>
+    <w:p>
+      <w:pPr>
+        <w:spacing w:after="100"/>
+        <w:ind w:left="240"/>
+      </w:pPr>
+      <w:r>
+        <w:t xml:space="preserve">4. </w:t>
+      </w:r>
       <w:r>
         <w:rPr>
-          <w:rFonts w:ascii="Times New Roman" w:hAnsi="Times New Roman" w:cs="Times New Roman"/>
-          <w:color w:val="FF0000"/>
+          <w:b/>
+          <w:bCs/>
         </w:rPr>
-        <w:t xml:space="preserve">To </w:t>
-      </w:r>
-      <w:proofErr w:type="gramStart"/>
-      <w:r>
+        <w:t>User Frequency</w:t>
+      </w:r>
+      <w:r>
+        <w:t>: How often will users use this feature?</w:t>
+      </w:r>
+    </w:p>
+    <w:p>
+      <w:pPr>
+        <w:spacing w:after="200"/>
+      </w:pPr>
+      <w:r>
+        <w:lastRenderedPageBreak/>
+        <w:t xml:space="preserve"> </w:t>
+      </w:r>
+    </w:p>
+    <w:p>
+      <w:pPr>
+        <w:pStyle w:val="3"/>
+        <w:spacing w:after="200"/>
+      </w:pPr>
+      <w:r>
+        <w:t>Priority Matrix</w:t>
+      </w:r>
+    </w:p>
+    <w:tbl>
+      <w:tblPr>
+        <w:tblW w:w="5000" w:type="pct"/>
+        <w:tblBorders>
+          <w:top w:val="single" w:sz="4" w:space="0" w:color="auto"/>
+          <w:left w:val="single" w:sz="4" w:space="0" w:color="auto"/>
+          <w:bottom w:val="single" w:sz="4" w:space="0" w:color="auto"/>
+          <w:right w:val="single" w:sz="4" w:space="0" w:color="auto"/>
+          <w:insideH w:val="single" w:sz="4" w:space="0" w:color="auto"/>
+          <w:insideV w:val="single" w:sz="4" w:space="0" w:color="auto"/>
+        </w:tblBorders>
+        <w:tblLayout w:type="fixed"/>
+        <w:tblCellMar>
+          <w:top w:w="80" w:type="dxa"/>
+          <w:left w:w="120" w:type="dxa"/>
+          <w:bottom w:w="80" w:type="dxa"/>
+          <w:right w:w="120" w:type="dxa"/>
+        </w:tblCellMar>
+        <w:tblLook w:val="0000" w:firstRow="0" w:lastRow="0" w:firstColumn="0" w:lastColumn="0" w:noHBand="0" w:noVBand="0"/>
+      </w:tblPr>
+      <w:tblGrid>
+        <w:gridCol w:w="3861"/>
+        <w:gridCol w:w="2150"/>
+        <w:gridCol w:w="3005"/>
+      </w:tblGrid>
+      <w:tr>
+        <w:trPr>
+          <w:tblHeader/>
+        </w:trPr>
+        <w:tc>
+          <w:tcPr>
+            <w:tcW w:w="4011" w:type="dxa"/>
+          </w:tcPr>
+          <w:p>
+            <w:r>
+              <w:rPr>
+                <w:b/>
+                <w:bCs/>
+              </w:rPr>
+              <w:t>Priority</w:t>
+            </w:r>
+          </w:p>
+        </w:tc>
+        <w:tc>
+          <w:tcPr>
+            <w:tcW w:w="2229" w:type="dxa"/>
+          </w:tcPr>
+          <w:p>
+            <w:r>
+              <w:rPr>
+                <w:b/>
+                <w:bCs/>
+              </w:rPr>
+              <w:t>Count</w:t>
+            </w:r>
+          </w:p>
+        </w:tc>
+        <w:tc>
+          <w:tcPr>
+            <w:tcW w:w="3120" w:type="dxa"/>
+          </w:tcPr>
+          <w:p>
+            <w:r>
+              <w:rPr>
+                <w:b/>
+                <w:bCs/>
+              </w:rPr>
+              <w:t>Story Points</w:t>
+            </w:r>
+          </w:p>
+        </w:tc>
+      </w:tr>
+      <w:tr>
+        <w:tc>
+          <w:tcPr>
+            <w:tcW w:w="4011" w:type="dxa"/>
+          </w:tcPr>
+          <w:p>
+            <w:r>
+              <w:t>High (Must Have)</w:t>
+            </w:r>
+          </w:p>
+        </w:tc>
+        <w:tc>
+          <w:tcPr>
+            <w:tcW w:w="2229" w:type="dxa"/>
+          </w:tcPr>
+          <w:p>
+            <w:r>
+              <w:t>13</w:t>
+            </w:r>
+          </w:p>
+        </w:tc>
+        <w:tc>
+          <w:tcPr>
+            <w:tcW w:w="3120" w:type="dxa"/>
+          </w:tcPr>
+          <w:p>
+            <w:r>
+              <w:t>45</w:t>
+            </w:r>
+          </w:p>
+        </w:tc>
+      </w:tr>
+      <w:tr>
+        <w:tc>
+          <w:tcPr>
+            <w:tcW w:w="4011" w:type="dxa"/>
+          </w:tcPr>
+          <w:p>
+            <w:r>
+              <w:t>Medium (Should Have)</w:t>
+            </w:r>
+          </w:p>
+        </w:tc>
+        <w:tc>
+          <w:tcPr>
+            <w:tcW w:w="2229" w:type="dxa"/>
+          </w:tcPr>
+          <w:p>
+            <w:r>
+              <w:t>6</w:t>
+            </w:r>
+          </w:p>
+        </w:tc>
+        <w:tc>
+          <w:tcPr>
+            <w:tcW w:w="3120" w:type="dxa"/>
+          </w:tcPr>
+          <w:p>
+            <w:r>
+              <w:t>20</w:t>
+            </w:r>
+          </w:p>
+        </w:tc>
+      </w:tr>
+      <w:tr>
+        <w:tc>
+          <w:tcPr>
+            <w:tcW w:w="4011" w:type="dxa"/>
+          </w:tcPr>
+          <w:p>
+            <w:r>
+              <w:t>Low (Could Have)</w:t>
+            </w:r>
+          </w:p>
+        </w:tc>
+        <w:tc>
+          <w:tcPr>
+            <w:tcW w:w="2229" w:type="dxa"/>
+          </w:tcPr>
+          <w:p>
+            <w:r>
+              <w:t>3</w:t>
+            </w:r>
+          </w:p>
+        </w:tc>
+        <w:tc>
+          <w:tcPr>
+            <w:tcW w:w="3120" w:type="dxa"/>
+          </w:tcPr>
+          <w:p>
+            <w:r>
+              <w:t>10</w:t>
+            </w:r>
+          </w:p>
+        </w:tc>
+      </w:tr>
+      <w:tr>
+        <w:tc>
+          <w:tcPr>
+            <w:tcW w:w="4011" w:type="dxa"/>
+          </w:tcPr>
+          <w:p>
+            <w:r>
+              <w:rPr>
+                <w:b/>
+                <w:bCs/>
+              </w:rPr>
+              <w:t>Total</w:t>
+            </w:r>
+          </w:p>
+        </w:tc>
+        <w:tc>
+          <w:tcPr>
+            <w:tcW w:w="2229" w:type="dxa"/>
+          </w:tcPr>
+          <w:p>
+            <w:r>
+              <w:rPr>
+                <w:b/>
+                <w:bCs/>
+              </w:rPr>
+              <w:t>22</w:t>
+            </w:r>
+          </w:p>
+        </w:tc>
+        <w:tc>
+          <w:tcPr>
+            <w:tcW w:w="3120" w:type="dxa"/>
+          </w:tcPr>
+          <w:p>
+            <w:r>
+              <w:rPr>
+                <w:b/>
+                <w:bCs/>
+              </w:rPr>
+              <w:t>75</w:t>
+            </w:r>
+          </w:p>
+        </w:tc>
+      </w:tr>
+    </w:tbl>
+    <w:p>
+      <w:pPr>
+        <w:pBdr>
+          <w:bottom w:val="single" w:sz="6" w:space="1" w:color="auto"/>
+        </w:pBdr>
+        <w:spacing w:after="120"/>
+      </w:pPr>
+    </w:p>
+    <w:p>
+      <w:pPr>
+        <w:spacing w:after="200"/>
+      </w:pPr>
+      <w:r>
+        <w:t xml:space="preserve"> </w:t>
+      </w:r>
+    </w:p>
+    <w:p>
+      <w:pPr>
+        <w:pStyle w:val="2"/>
+        <w:spacing w:after="200"/>
+      </w:pPr>
+      <w:r>
+        <w:t>1.5 Estimation Methods</w:t>
+      </w:r>
+    </w:p>
+    <w:p>
+      <w:pPr>
+        <w:widowControl w:val="0"/>
+        <w:spacing w:after="120" w:line="240" w:lineRule="auto"/>
         <w:rPr>
-          <w:rFonts w:ascii="Times New Roman" w:hAnsi="Times New Roman" w:cs="Times New Roman"/>
-          <w:color w:val="FF0000"/>
+          <w:rFonts w:ascii="Times New Roman" w:eastAsia="等线" w:hAnsi="Times New Roman" w:cs="Times New Roman"/>
+          <w:kern w:val="0"/>
+          <w:lang w:val="en-US"/>
+          <w14:ligatures w14:val="none"/>
         </w:rPr>
-        <w:t>here  -</w:t>
-      </w:r>
-      <w:proofErr w:type="gramEnd"/>
+      </w:pPr>
       <w:r>
         <w:rPr>
-          <w:rFonts w:ascii="Times New Roman" w:hAnsi="Times New Roman" w:cs="Times New Roman"/>
-          <w:color w:val="FF0000"/>
+          <w:rFonts w:ascii="Times New Roman" w:eastAsia="等线" w:hAnsi="Times New Roman" w:cs="Times New Roman"/>
+          <w:kern w:val="0"/>
+          <w:lang w:val="en-US"/>
+          <w14:ligatures w14:val="none"/>
+        </w:rPr>
+        <w:t xml:space="preserve">We used </w:t>
+      </w:r>
+      <w:r>
+        <w:rPr>
+          <w:rFonts w:ascii="Times New Roman" w:eastAsia="等线" w:hAnsi="Times New Roman" w:cs="Times New Roman"/>
+          <w:b/>
+          <w:bCs/>
+          <w:kern w:val="0"/>
+          <w:lang w:val="en-US"/>
+          <w14:ligatures w14:val="none"/>
+        </w:rPr>
+        <w:t>Planning Poker</w:t>
+      </w:r>
+      <w:r>
+        <w:rPr>
+          <w:rFonts w:ascii="Times New Roman" w:eastAsia="等线" w:hAnsi="Times New Roman" w:cs="Times New Roman"/>
+          <w:kern w:val="0"/>
+          <w:lang w:val="en-US"/>
+          <w14:ligatures w14:val="none"/>
+        </w:rPr>
+        <w:t xml:space="preserve"> (Fibonacci sequence) for story point estimation: </w:t>
+      </w:r>
+    </w:p>
+    <w:tbl>
+      <w:tblPr>
+        <w:tblW w:w="5000" w:type="pct"/>
+        <w:tblBorders>
+          <w:top w:val="single" w:sz="4" w:space="0" w:color="auto"/>
+          <w:left w:val="single" w:sz="4" w:space="0" w:color="auto"/>
+          <w:bottom w:val="single" w:sz="4" w:space="0" w:color="auto"/>
+          <w:right w:val="single" w:sz="4" w:space="0" w:color="auto"/>
+          <w:insideH w:val="single" w:sz="4" w:space="0" w:color="auto"/>
+          <w:insideV w:val="single" w:sz="4" w:space="0" w:color="auto"/>
+        </w:tblBorders>
+        <w:tblLayout w:type="fixed"/>
+        <w:tblCellMar>
+          <w:top w:w="80" w:type="dxa"/>
+          <w:left w:w="120" w:type="dxa"/>
+          <w:bottom w:w="80" w:type="dxa"/>
+          <w:right w:w="120" w:type="dxa"/>
+        </w:tblCellMar>
+        <w:tblLook w:val="04A0" w:firstRow="1" w:lastRow="0" w:firstColumn="1" w:lastColumn="0" w:noHBand="0" w:noVBand="1"/>
+      </w:tblPr>
+      <w:tblGrid>
+        <w:gridCol w:w="3009"/>
+        <w:gridCol w:w="6007"/>
+      </w:tblGrid>
+      <w:tr>
+        <w:trPr>
+          <w:tblHeader/>
+        </w:trPr>
+        <w:tc>
+          <w:tcPr>
+            <w:tcW w:w="3120" w:type="dxa"/>
+            <w:tcBorders>
+              <w:top w:val="single" w:sz="4" w:space="0" w:color="auto"/>
+              <w:left w:val="single" w:sz="4" w:space="0" w:color="auto"/>
+              <w:bottom w:val="single" w:sz="4" w:space="0" w:color="auto"/>
+              <w:right w:val="single" w:sz="4" w:space="0" w:color="auto"/>
+            </w:tcBorders>
+            <w:hideMark/>
+          </w:tcPr>
+          <w:p>
+            <w:pPr>
+              <w:widowControl w:val="0"/>
+              <w:spacing w:after="0" w:line="240" w:lineRule="auto"/>
+              <w:rPr>
+                <w:rFonts w:ascii="Times New Roman" w:eastAsia="等线" w:hAnsi="Times New Roman" w:cs="Times New Roman"/>
+                <w:kern w:val="0"/>
+                <w:lang w:val="en-US"/>
+                <w14:ligatures w14:val="none"/>
+              </w:rPr>
+            </w:pPr>
+            <w:r>
+              <w:rPr>
+                <w:rFonts w:ascii="Times New Roman" w:eastAsia="等线" w:hAnsi="Times New Roman" w:cs="Times New Roman"/>
+                <w:b/>
+                <w:bCs/>
+                <w:kern w:val="0"/>
+                <w:lang w:val="en-US"/>
+                <w14:ligatures w14:val="none"/>
+              </w:rPr>
+              <w:t>Points</w:t>
+            </w:r>
+          </w:p>
+        </w:tc>
+        <w:tc>
+          <w:tcPr>
+            <w:tcW w:w="6240" w:type="dxa"/>
+            <w:tcBorders>
+              <w:top w:val="single" w:sz="4" w:space="0" w:color="auto"/>
+              <w:left w:val="single" w:sz="4" w:space="0" w:color="auto"/>
+              <w:bottom w:val="single" w:sz="4" w:space="0" w:color="auto"/>
+              <w:right w:val="single" w:sz="4" w:space="0" w:color="auto"/>
+            </w:tcBorders>
+            <w:hideMark/>
+          </w:tcPr>
+          <w:p>
+            <w:pPr>
+              <w:widowControl w:val="0"/>
+              <w:spacing w:after="0" w:line="240" w:lineRule="auto"/>
+              <w:rPr>
+                <w:rFonts w:ascii="Times New Roman" w:eastAsia="等线" w:hAnsi="Times New Roman" w:cs="Times New Roman"/>
+                <w:kern w:val="0"/>
+                <w:lang w:val="en-US"/>
+                <w14:ligatures w14:val="none"/>
+              </w:rPr>
+            </w:pPr>
+            <w:r>
+              <w:rPr>
+                <w:rFonts w:ascii="Times New Roman" w:eastAsia="等线" w:hAnsi="Times New Roman" w:cs="Times New Roman"/>
+                <w:b/>
+                <w:bCs/>
+                <w:kern w:val="0"/>
+                <w:lang w:val="en-US"/>
+                <w14:ligatures w14:val="none"/>
+              </w:rPr>
+              <w:t>Complexity</w:t>
+            </w:r>
+          </w:p>
+        </w:tc>
+      </w:tr>
+      <w:tr>
+        <w:tc>
+          <w:tcPr>
+            <w:tcW w:w="3120" w:type="dxa"/>
+            <w:tcBorders>
+              <w:top w:val="single" w:sz="4" w:space="0" w:color="auto"/>
+              <w:left w:val="single" w:sz="4" w:space="0" w:color="auto"/>
+              <w:bottom w:val="single" w:sz="4" w:space="0" w:color="auto"/>
+              <w:right w:val="single" w:sz="4" w:space="0" w:color="auto"/>
+            </w:tcBorders>
+            <w:hideMark/>
+          </w:tcPr>
+          <w:p>
+            <w:pPr>
+              <w:widowControl w:val="0"/>
+              <w:spacing w:after="0" w:line="240" w:lineRule="auto"/>
+              <w:rPr>
+                <w:rFonts w:ascii="Times New Roman" w:eastAsia="等线" w:hAnsi="Times New Roman" w:cs="Times New Roman"/>
+                <w:kern w:val="0"/>
+                <w:lang w:val="en-US"/>
+                <w14:ligatures w14:val="none"/>
+              </w:rPr>
+            </w:pPr>
+            <w:r>
+              <w:rPr>
+                <w:rFonts w:ascii="Times New Roman" w:eastAsia="等线" w:hAnsi="Times New Roman" w:cs="Times New Roman"/>
+                <w:kern w:val="0"/>
+                <w:lang w:val="en-US"/>
+                <w14:ligatures w14:val="none"/>
+              </w:rPr>
+              <w:t>1-2</w:t>
+            </w:r>
+          </w:p>
+        </w:tc>
+        <w:tc>
+          <w:tcPr>
+            <w:tcW w:w="6240" w:type="dxa"/>
+            <w:tcBorders>
+              <w:top w:val="single" w:sz="4" w:space="0" w:color="auto"/>
+              <w:left w:val="single" w:sz="4" w:space="0" w:color="auto"/>
+              <w:bottom w:val="single" w:sz="4" w:space="0" w:color="auto"/>
+              <w:right w:val="single" w:sz="4" w:space="0" w:color="auto"/>
+            </w:tcBorders>
+            <w:hideMark/>
+          </w:tcPr>
+          <w:p>
+            <w:pPr>
+              <w:widowControl w:val="0"/>
+              <w:spacing w:after="0" w:line="240" w:lineRule="auto"/>
+              <w:rPr>
+                <w:rFonts w:ascii="Times New Roman" w:eastAsia="等线" w:hAnsi="Times New Roman" w:cs="Times New Roman"/>
+                <w:kern w:val="0"/>
+                <w:lang w:val="en-US"/>
+                <w14:ligatures w14:val="none"/>
+              </w:rPr>
+            </w:pPr>
+            <w:r>
+              <w:rPr>
+                <w:rFonts w:ascii="Times New Roman" w:eastAsia="等线" w:hAnsi="Times New Roman" w:cs="Times New Roman"/>
+                <w:kern w:val="0"/>
+                <w:lang w:val="en-US"/>
+                <w14:ligatures w14:val="none"/>
+              </w:rPr>
+              <w:t>Simple, straightforward</w:t>
+            </w:r>
+          </w:p>
+        </w:tc>
+      </w:tr>
+      <w:tr>
+        <w:tc>
+          <w:tcPr>
+            <w:tcW w:w="3120" w:type="dxa"/>
+            <w:tcBorders>
+              <w:top w:val="single" w:sz="4" w:space="0" w:color="auto"/>
+              <w:left w:val="single" w:sz="4" w:space="0" w:color="auto"/>
+              <w:bottom w:val="single" w:sz="4" w:space="0" w:color="auto"/>
+              <w:right w:val="single" w:sz="4" w:space="0" w:color="auto"/>
+            </w:tcBorders>
+            <w:hideMark/>
+          </w:tcPr>
+          <w:p>
+            <w:pPr>
+              <w:widowControl w:val="0"/>
+              <w:spacing w:after="0" w:line="240" w:lineRule="auto"/>
+              <w:rPr>
+                <w:rFonts w:ascii="Times New Roman" w:eastAsia="等线" w:hAnsi="Times New Roman" w:cs="Times New Roman"/>
+                <w:kern w:val="0"/>
+                <w:lang w:val="en-US"/>
+                <w14:ligatures w14:val="none"/>
+              </w:rPr>
+            </w:pPr>
+            <w:r>
+              <w:rPr>
+                <w:rFonts w:ascii="Times New Roman" w:eastAsia="等线" w:hAnsi="Times New Roman" w:cs="Times New Roman"/>
+                <w:kern w:val="0"/>
+                <w:lang w:val="en-US"/>
+                <w14:ligatures w14:val="none"/>
+              </w:rPr>
+              <w:t>3</w:t>
+            </w:r>
+          </w:p>
+        </w:tc>
+        <w:tc>
+          <w:tcPr>
+            <w:tcW w:w="6240" w:type="dxa"/>
+            <w:tcBorders>
+              <w:top w:val="single" w:sz="4" w:space="0" w:color="auto"/>
+              <w:left w:val="single" w:sz="4" w:space="0" w:color="auto"/>
+              <w:bottom w:val="single" w:sz="4" w:space="0" w:color="auto"/>
+              <w:right w:val="single" w:sz="4" w:space="0" w:color="auto"/>
+            </w:tcBorders>
+            <w:hideMark/>
+          </w:tcPr>
+          <w:p>
+            <w:pPr>
+              <w:widowControl w:val="0"/>
+              <w:spacing w:after="0" w:line="240" w:lineRule="auto"/>
+              <w:rPr>
+                <w:rFonts w:ascii="Times New Roman" w:eastAsia="等线" w:hAnsi="Times New Roman" w:cs="Times New Roman"/>
+                <w:kern w:val="0"/>
+                <w:lang w:val="en-US"/>
+                <w14:ligatures w14:val="none"/>
+              </w:rPr>
+            </w:pPr>
+            <w:r>
+              <w:rPr>
+                <w:rFonts w:ascii="Times New Roman" w:eastAsia="等线" w:hAnsi="Times New Roman" w:cs="Times New Roman"/>
+                <w:kern w:val="0"/>
+                <w:lang w:val="en-US"/>
+                <w14:ligatures w14:val="none"/>
+              </w:rPr>
+              <w:t>Moderate complexity</w:t>
+            </w:r>
+          </w:p>
+        </w:tc>
+      </w:tr>
+      <w:tr>
+        <w:tc>
+          <w:tcPr>
+            <w:tcW w:w="3120" w:type="dxa"/>
+            <w:tcBorders>
+              <w:top w:val="single" w:sz="4" w:space="0" w:color="auto"/>
+              <w:left w:val="single" w:sz="4" w:space="0" w:color="auto"/>
+              <w:bottom w:val="single" w:sz="4" w:space="0" w:color="auto"/>
+              <w:right w:val="single" w:sz="4" w:space="0" w:color="auto"/>
+            </w:tcBorders>
+            <w:hideMark/>
+          </w:tcPr>
+          <w:p>
+            <w:pPr>
+              <w:widowControl w:val="0"/>
+              <w:spacing w:after="0" w:line="240" w:lineRule="auto"/>
+              <w:rPr>
+                <w:rFonts w:ascii="Times New Roman" w:eastAsia="等线" w:hAnsi="Times New Roman" w:cs="Times New Roman"/>
+                <w:kern w:val="0"/>
+                <w:lang w:val="en-US"/>
+                <w14:ligatures w14:val="none"/>
+              </w:rPr>
+            </w:pPr>
+            <w:r>
+              <w:rPr>
+                <w:rFonts w:ascii="Times New Roman" w:eastAsia="等线" w:hAnsi="Times New Roman" w:cs="Times New Roman"/>
+                <w:kern w:val="0"/>
+                <w:lang w:val="en-US"/>
+                <w14:ligatures w14:val="none"/>
+              </w:rPr>
+              <w:t>5</w:t>
+            </w:r>
+          </w:p>
+        </w:tc>
+        <w:tc>
+          <w:tcPr>
+            <w:tcW w:w="6240" w:type="dxa"/>
+            <w:tcBorders>
+              <w:top w:val="single" w:sz="4" w:space="0" w:color="auto"/>
+              <w:left w:val="single" w:sz="4" w:space="0" w:color="auto"/>
+              <w:bottom w:val="single" w:sz="4" w:space="0" w:color="auto"/>
+              <w:right w:val="single" w:sz="4" w:space="0" w:color="auto"/>
+            </w:tcBorders>
+            <w:hideMark/>
+          </w:tcPr>
+          <w:p>
+            <w:pPr>
+              <w:widowControl w:val="0"/>
+              <w:spacing w:after="0" w:line="240" w:lineRule="auto"/>
+              <w:rPr>
+                <w:rFonts w:ascii="Times New Roman" w:eastAsia="等线" w:hAnsi="Times New Roman" w:cs="Times New Roman"/>
+                <w:kern w:val="0"/>
+                <w:lang w:val="en-US"/>
+                <w14:ligatures w14:val="none"/>
+              </w:rPr>
+            </w:pPr>
+            <w:r>
+              <w:rPr>
+                <w:rFonts w:ascii="Times New Roman" w:eastAsia="等线" w:hAnsi="Times New Roman" w:cs="Times New Roman"/>
+                <w:kern w:val="0"/>
+                <w:lang w:val="en-US"/>
+                <w14:ligatures w14:val="none"/>
+              </w:rPr>
+              <w:t>Significant effort</w:t>
+            </w:r>
+          </w:p>
+        </w:tc>
+      </w:tr>
+      <w:tr>
+        <w:tc>
+          <w:tcPr>
+            <w:tcW w:w="3120" w:type="dxa"/>
+            <w:tcBorders>
+              <w:top w:val="single" w:sz="4" w:space="0" w:color="auto"/>
+              <w:left w:val="single" w:sz="4" w:space="0" w:color="auto"/>
+              <w:bottom w:val="single" w:sz="4" w:space="0" w:color="auto"/>
+              <w:right w:val="single" w:sz="4" w:space="0" w:color="auto"/>
+            </w:tcBorders>
+            <w:hideMark/>
+          </w:tcPr>
+          <w:p>
+            <w:pPr>
+              <w:widowControl w:val="0"/>
+              <w:spacing w:after="0" w:line="240" w:lineRule="auto"/>
+              <w:rPr>
+                <w:rFonts w:ascii="Times New Roman" w:eastAsia="等线" w:hAnsi="Times New Roman" w:cs="Times New Roman"/>
+                <w:kern w:val="0"/>
+                <w:lang w:val="en-US"/>
+                <w14:ligatures w14:val="none"/>
+              </w:rPr>
+            </w:pPr>
+            <w:r>
+              <w:rPr>
+                <w:rFonts w:ascii="Times New Roman" w:eastAsia="等线" w:hAnsi="Times New Roman" w:cs="Times New Roman"/>
+                <w:kern w:val="0"/>
+                <w:lang w:val="en-US"/>
+                <w14:ligatures w14:val="none"/>
+              </w:rPr>
+              <w:t>8+</w:t>
+            </w:r>
+          </w:p>
+        </w:tc>
+        <w:tc>
+          <w:tcPr>
+            <w:tcW w:w="6240" w:type="dxa"/>
+            <w:tcBorders>
+              <w:top w:val="single" w:sz="4" w:space="0" w:color="auto"/>
+              <w:left w:val="single" w:sz="4" w:space="0" w:color="auto"/>
+              <w:bottom w:val="single" w:sz="4" w:space="0" w:color="auto"/>
+              <w:right w:val="single" w:sz="4" w:space="0" w:color="auto"/>
+            </w:tcBorders>
+            <w:hideMark/>
+          </w:tcPr>
+          <w:p>
+            <w:pPr>
+              <w:widowControl w:val="0"/>
+              <w:spacing w:after="0" w:line="240" w:lineRule="auto"/>
+              <w:rPr>
+                <w:rFonts w:ascii="Times New Roman" w:eastAsia="等线" w:hAnsi="Times New Roman" w:cs="Times New Roman"/>
+                <w:kern w:val="0"/>
+                <w:lang w:val="en-US"/>
+                <w14:ligatures w14:val="none"/>
+              </w:rPr>
+            </w:pPr>
+            <w:r>
+              <w:rPr>
+                <w:rFonts w:ascii="Times New Roman" w:eastAsia="等线" w:hAnsi="Times New Roman" w:cs="Times New Roman"/>
+                <w:kern w:val="0"/>
+                <w:lang w:val="en-US"/>
+                <w14:ligatures w14:val="none"/>
+              </w:rPr>
+              <w:t>Complex, needs research</w:t>
+            </w:r>
+          </w:p>
+        </w:tc>
+      </w:tr>
+    </w:tbl>
+    <w:p>
+      <w:pPr>
+        <w:widowControl w:val="0"/>
+        <w:spacing w:after="120" w:line="240" w:lineRule="auto"/>
+        <w:rPr>
+          <w:rFonts w:ascii="Times New Roman" w:eastAsia="等线" w:hAnsi="Times New Roman" w:cs="Times New Roman"/>
+          <w:kern w:val="0"/>
+          <w:lang w:val="en-US"/>
+          <w14:ligatures w14:val="none"/>
+        </w:rPr>
+      </w:pPr>
+      <w:r>
+        <w:rPr>
+          <w:rFonts w:ascii="Times New Roman" w:eastAsia="等线" w:hAnsi="Times New Roman" w:cs="Times New Roman"/>
+          <w:b/>
+          <w:bCs/>
+          <w:kern w:val="0"/>
+          <w:lang w:val="en-US"/>
+          <w14:ligatures w14:val="none"/>
+        </w:rPr>
+        <w:t>Total: 22 stories, 75 story points</w:t>
+      </w:r>
+    </w:p>
+    <w:p>
+      <w:pPr>
+        <w:widowControl w:val="0"/>
+        <w:spacing w:after="200" w:line="240" w:lineRule="auto"/>
+        <w:rPr>
+          <w:rFonts w:ascii="Times New Roman" w:eastAsia="等线" w:hAnsi="Times New Roman" w:cs="Times New Roman"/>
+          <w:kern w:val="0"/>
+          <w:lang w:val="en-US"/>
+          <w14:ligatures w14:val="none"/>
+        </w:rPr>
+      </w:pPr>
+      <w:r>
+        <w:rPr>
+          <w:rFonts w:ascii="Times New Roman" w:eastAsia="等线" w:hAnsi="Times New Roman" w:cs="Times New Roman"/>
+          <w:kern w:val="0"/>
+          <w:lang w:val="en-US"/>
+          <w14:ligatures w14:val="none"/>
         </w:rPr>
         <w:t xml:space="preserve"> </w:t>
       </w:r>
+    </w:p>
+    <w:tbl>
+      <w:tblPr>
+        <w:tblW w:w="5000" w:type="pct"/>
+        <w:tblBorders>
+          <w:top w:val="single" w:sz="4" w:space="0" w:color="auto"/>
+          <w:left w:val="single" w:sz="4" w:space="0" w:color="auto"/>
+          <w:bottom w:val="single" w:sz="4" w:space="0" w:color="auto"/>
+          <w:right w:val="single" w:sz="4" w:space="0" w:color="auto"/>
+          <w:insideH w:val="single" w:sz="4" w:space="0" w:color="auto"/>
+          <w:insideV w:val="single" w:sz="4" w:space="0" w:color="auto"/>
+        </w:tblBorders>
+        <w:tblLayout w:type="fixed"/>
+        <w:tblCellMar>
+          <w:top w:w="80" w:type="dxa"/>
+          <w:left w:w="120" w:type="dxa"/>
+          <w:bottom w:w="80" w:type="dxa"/>
+          <w:right w:w="120" w:type="dxa"/>
+        </w:tblCellMar>
+        <w:tblLook w:val="04A0" w:firstRow="1" w:lastRow="0" w:firstColumn="1" w:lastColumn="0" w:noHBand="0" w:noVBand="1"/>
+      </w:tblPr>
+      <w:tblGrid>
+        <w:gridCol w:w="2925"/>
+        <w:gridCol w:w="2439"/>
+        <w:gridCol w:w="3652"/>
+      </w:tblGrid>
+      <w:tr>
+        <w:trPr>
+          <w:tblHeader/>
+        </w:trPr>
+        <w:tc>
+          <w:tcPr>
+            <w:tcW w:w="3036" w:type="dxa"/>
+            <w:tcBorders>
+              <w:top w:val="single" w:sz="4" w:space="0" w:color="auto"/>
+              <w:left w:val="single" w:sz="4" w:space="0" w:color="auto"/>
+              <w:bottom w:val="single" w:sz="4" w:space="0" w:color="auto"/>
+              <w:right w:val="single" w:sz="4" w:space="0" w:color="auto"/>
+            </w:tcBorders>
+            <w:hideMark/>
+          </w:tcPr>
+          <w:p>
+            <w:pPr>
+              <w:widowControl w:val="0"/>
+              <w:spacing w:after="0" w:line="240" w:lineRule="auto"/>
+              <w:rPr>
+                <w:rFonts w:ascii="Times New Roman" w:eastAsia="等线" w:hAnsi="Times New Roman" w:cs="Times New Roman"/>
+                <w:kern w:val="0"/>
+                <w:lang w:val="en-US"/>
+                <w14:ligatures w14:val="none"/>
+              </w:rPr>
+            </w:pPr>
+            <w:r>
+              <w:rPr>
+                <w:rFonts w:ascii="Times New Roman" w:eastAsia="等线" w:hAnsi="Times New Roman" w:cs="Times New Roman"/>
+                <w:b/>
+                <w:bCs/>
+                <w:kern w:val="0"/>
+                <w:lang w:val="en-US"/>
+                <w14:ligatures w14:val="none"/>
+              </w:rPr>
+              <w:t>Sprint</w:t>
+            </w:r>
+          </w:p>
+        </w:tc>
+        <w:tc>
+          <w:tcPr>
+            <w:tcW w:w="2530" w:type="dxa"/>
+            <w:tcBorders>
+              <w:top w:val="single" w:sz="4" w:space="0" w:color="auto"/>
+              <w:left w:val="single" w:sz="4" w:space="0" w:color="auto"/>
+              <w:bottom w:val="single" w:sz="4" w:space="0" w:color="auto"/>
+              <w:right w:val="single" w:sz="4" w:space="0" w:color="auto"/>
+            </w:tcBorders>
+            <w:hideMark/>
+          </w:tcPr>
+          <w:p>
+            <w:pPr>
+              <w:widowControl w:val="0"/>
+              <w:spacing w:after="0" w:line="240" w:lineRule="auto"/>
+              <w:rPr>
+                <w:rFonts w:ascii="Times New Roman" w:eastAsia="等线" w:hAnsi="Times New Roman" w:cs="Times New Roman"/>
+                <w:kern w:val="0"/>
+                <w:lang w:val="en-US"/>
+                <w14:ligatures w14:val="none"/>
+              </w:rPr>
+            </w:pPr>
+            <w:r>
+              <w:rPr>
+                <w:rFonts w:ascii="Times New Roman" w:eastAsia="等线" w:hAnsi="Times New Roman" w:cs="Times New Roman"/>
+                <w:b/>
+                <w:bCs/>
+                <w:kern w:val="0"/>
+                <w:lang w:val="en-US"/>
+                <w14:ligatures w14:val="none"/>
+              </w:rPr>
+              <w:t>Points</w:t>
+            </w:r>
+          </w:p>
+        </w:tc>
+        <w:tc>
+          <w:tcPr>
+            <w:tcW w:w="3794" w:type="dxa"/>
+            <w:tcBorders>
+              <w:top w:val="single" w:sz="4" w:space="0" w:color="auto"/>
+              <w:left w:val="single" w:sz="4" w:space="0" w:color="auto"/>
+              <w:bottom w:val="single" w:sz="4" w:space="0" w:color="auto"/>
+              <w:right w:val="single" w:sz="4" w:space="0" w:color="auto"/>
+            </w:tcBorders>
+            <w:hideMark/>
+          </w:tcPr>
+          <w:p>
+            <w:pPr>
+              <w:widowControl w:val="0"/>
+              <w:spacing w:after="0" w:line="240" w:lineRule="auto"/>
+              <w:rPr>
+                <w:rFonts w:ascii="Times New Roman" w:eastAsia="等线" w:hAnsi="Times New Roman" w:cs="Times New Roman"/>
+                <w:kern w:val="0"/>
+                <w:lang w:val="en-US"/>
+                <w14:ligatures w14:val="none"/>
+              </w:rPr>
+            </w:pPr>
+            <w:r>
+              <w:rPr>
+                <w:rFonts w:ascii="Times New Roman" w:eastAsia="等线" w:hAnsi="Times New Roman" w:cs="Times New Roman"/>
+                <w:b/>
+                <w:bCs/>
+                <w:kern w:val="0"/>
+                <w:lang w:val="en-US"/>
+                <w14:ligatures w14:val="none"/>
+              </w:rPr>
+              <w:t>Focus</w:t>
+            </w:r>
+          </w:p>
+        </w:tc>
+      </w:tr>
+      <w:tr>
+        <w:tc>
+          <w:tcPr>
+            <w:tcW w:w="3036" w:type="dxa"/>
+            <w:tcBorders>
+              <w:top w:val="single" w:sz="4" w:space="0" w:color="auto"/>
+              <w:left w:val="single" w:sz="4" w:space="0" w:color="auto"/>
+              <w:bottom w:val="single" w:sz="4" w:space="0" w:color="auto"/>
+              <w:right w:val="single" w:sz="4" w:space="0" w:color="auto"/>
+            </w:tcBorders>
+            <w:hideMark/>
+          </w:tcPr>
+          <w:p>
+            <w:pPr>
+              <w:widowControl w:val="0"/>
+              <w:spacing w:after="0" w:line="240" w:lineRule="auto"/>
+              <w:rPr>
+                <w:rFonts w:ascii="Times New Roman" w:eastAsia="等线" w:hAnsi="Times New Roman" w:cs="Times New Roman"/>
+                <w:kern w:val="0"/>
+                <w:lang w:val="en-US"/>
+                <w14:ligatures w14:val="none"/>
+              </w:rPr>
+            </w:pPr>
+            <w:r>
+              <w:rPr>
+                <w:rFonts w:ascii="Times New Roman" w:eastAsia="等线" w:hAnsi="Times New Roman" w:cs="Times New Roman"/>
+                <w:kern w:val="0"/>
+                <w:lang w:val="en-US"/>
+                <w14:ligatures w14:val="none"/>
+              </w:rPr>
+              <w:t>Sprint 1</w:t>
+            </w:r>
+          </w:p>
+        </w:tc>
+        <w:tc>
+          <w:tcPr>
+            <w:tcW w:w="2530" w:type="dxa"/>
+            <w:tcBorders>
+              <w:top w:val="single" w:sz="4" w:space="0" w:color="auto"/>
+              <w:left w:val="single" w:sz="4" w:space="0" w:color="auto"/>
+              <w:bottom w:val="single" w:sz="4" w:space="0" w:color="auto"/>
+              <w:right w:val="single" w:sz="4" w:space="0" w:color="auto"/>
+            </w:tcBorders>
+            <w:hideMark/>
+          </w:tcPr>
+          <w:p>
+            <w:pPr>
+              <w:widowControl w:val="0"/>
+              <w:spacing w:after="0" w:line="240" w:lineRule="auto"/>
+              <w:rPr>
+                <w:rFonts w:ascii="Times New Roman" w:eastAsia="等线" w:hAnsi="Times New Roman" w:cs="Times New Roman"/>
+                <w:kern w:val="0"/>
+                <w:lang w:val="en-US"/>
+                <w14:ligatures w14:val="none"/>
+              </w:rPr>
+            </w:pPr>
+            <w:r>
+              <w:rPr>
+                <w:rFonts w:ascii="Times New Roman" w:eastAsia="等线" w:hAnsi="Times New Roman" w:cs="Times New Roman"/>
+                <w:kern w:val="0"/>
+                <w:lang w:val="en-US"/>
+                <w14:ligatures w14:val="none"/>
+              </w:rPr>
+              <w:t>17</w:t>
+            </w:r>
+          </w:p>
+        </w:tc>
+        <w:tc>
+          <w:tcPr>
+            <w:tcW w:w="3794" w:type="dxa"/>
+            <w:tcBorders>
+              <w:top w:val="single" w:sz="4" w:space="0" w:color="auto"/>
+              <w:left w:val="single" w:sz="4" w:space="0" w:color="auto"/>
+              <w:bottom w:val="single" w:sz="4" w:space="0" w:color="auto"/>
+              <w:right w:val="single" w:sz="4" w:space="0" w:color="auto"/>
+            </w:tcBorders>
+            <w:hideMark/>
+          </w:tcPr>
+          <w:p>
+            <w:pPr>
+              <w:widowControl w:val="0"/>
+              <w:spacing w:after="0" w:line="240" w:lineRule="auto"/>
+              <w:rPr>
+                <w:rFonts w:ascii="Times New Roman" w:eastAsia="等线" w:hAnsi="Times New Roman" w:cs="Times New Roman"/>
+                <w:kern w:val="0"/>
+                <w:lang w:val="en-US"/>
+                <w14:ligatures w14:val="none"/>
+              </w:rPr>
+            </w:pPr>
+            <w:r>
+              <w:rPr>
+                <w:rFonts w:ascii="Times New Roman" w:eastAsia="等线" w:hAnsi="Times New Roman" w:cs="Times New Roman"/>
+                <w:kern w:val="0"/>
+                <w:lang w:val="en-US"/>
+                <w14:ligatures w14:val="none"/>
+              </w:rPr>
+              <w:t>Documentation</w:t>
+            </w:r>
+          </w:p>
+        </w:tc>
+      </w:tr>
+      <w:tr>
+        <w:tc>
+          <w:tcPr>
+            <w:tcW w:w="3036" w:type="dxa"/>
+            <w:tcBorders>
+              <w:top w:val="single" w:sz="4" w:space="0" w:color="auto"/>
+              <w:left w:val="single" w:sz="4" w:space="0" w:color="auto"/>
+              <w:bottom w:val="single" w:sz="4" w:space="0" w:color="auto"/>
+              <w:right w:val="single" w:sz="4" w:space="0" w:color="auto"/>
+            </w:tcBorders>
+            <w:hideMark/>
+          </w:tcPr>
+          <w:p>
+            <w:pPr>
+              <w:widowControl w:val="0"/>
+              <w:spacing w:after="0" w:line="240" w:lineRule="auto"/>
+              <w:rPr>
+                <w:rFonts w:ascii="Times New Roman" w:eastAsia="等线" w:hAnsi="Times New Roman" w:cs="Times New Roman"/>
+                <w:kern w:val="0"/>
+                <w:lang w:val="en-US"/>
+                <w14:ligatures w14:val="none"/>
+              </w:rPr>
+            </w:pPr>
+            <w:r>
+              <w:rPr>
+                <w:rFonts w:ascii="Times New Roman" w:eastAsia="等线" w:hAnsi="Times New Roman" w:cs="Times New Roman"/>
+                <w:kern w:val="0"/>
+                <w:lang w:val="en-US"/>
+                <w14:ligatures w14:val="none"/>
+              </w:rPr>
+              <w:t>Sprint 2</w:t>
+            </w:r>
+          </w:p>
+        </w:tc>
+        <w:tc>
+          <w:tcPr>
+            <w:tcW w:w="2530" w:type="dxa"/>
+            <w:tcBorders>
+              <w:top w:val="single" w:sz="4" w:space="0" w:color="auto"/>
+              <w:left w:val="single" w:sz="4" w:space="0" w:color="auto"/>
+              <w:bottom w:val="single" w:sz="4" w:space="0" w:color="auto"/>
+              <w:right w:val="single" w:sz="4" w:space="0" w:color="auto"/>
+            </w:tcBorders>
+            <w:hideMark/>
+          </w:tcPr>
+          <w:p>
+            <w:pPr>
+              <w:widowControl w:val="0"/>
+              <w:spacing w:after="0" w:line="240" w:lineRule="auto"/>
+              <w:rPr>
+                <w:rFonts w:ascii="Times New Roman" w:eastAsia="等线" w:hAnsi="Times New Roman" w:cs="Times New Roman"/>
+                <w:kern w:val="0"/>
+                <w:lang w:val="en-US"/>
+                <w14:ligatures w14:val="none"/>
+              </w:rPr>
+            </w:pPr>
+            <w:r>
+              <w:rPr>
+                <w:rFonts w:ascii="Times New Roman" w:eastAsia="等线" w:hAnsi="Times New Roman" w:cs="Times New Roman"/>
+                <w:kern w:val="0"/>
+                <w:lang w:val="en-US"/>
+                <w14:ligatures w14:val="none"/>
+              </w:rPr>
+              <w:t>26</w:t>
+            </w:r>
+          </w:p>
+        </w:tc>
+        <w:tc>
+          <w:tcPr>
+            <w:tcW w:w="3794" w:type="dxa"/>
+            <w:tcBorders>
+              <w:top w:val="single" w:sz="4" w:space="0" w:color="auto"/>
+              <w:left w:val="single" w:sz="4" w:space="0" w:color="auto"/>
+              <w:bottom w:val="single" w:sz="4" w:space="0" w:color="auto"/>
+              <w:right w:val="single" w:sz="4" w:space="0" w:color="auto"/>
+            </w:tcBorders>
+            <w:hideMark/>
+          </w:tcPr>
+          <w:p>
+            <w:pPr>
+              <w:widowControl w:val="0"/>
+              <w:spacing w:after="0" w:line="240" w:lineRule="auto"/>
+              <w:rPr>
+                <w:rFonts w:ascii="Times New Roman" w:eastAsia="等线" w:hAnsi="Times New Roman" w:cs="Times New Roman"/>
+                <w:kern w:val="0"/>
+                <w:lang w:val="en-US"/>
+                <w14:ligatures w14:val="none"/>
+              </w:rPr>
+            </w:pPr>
+            <w:r>
+              <w:rPr>
+                <w:rFonts w:ascii="Times New Roman" w:eastAsia="等线" w:hAnsi="Times New Roman" w:cs="Times New Roman"/>
+                <w:kern w:val="0"/>
+                <w:lang w:val="en-US"/>
+                <w14:ligatures w14:val="none"/>
+              </w:rPr>
+              <w:t>Core features</w:t>
+            </w:r>
+          </w:p>
+        </w:tc>
+      </w:tr>
+      <w:tr>
+        <w:tc>
+          <w:tcPr>
+            <w:tcW w:w="3036" w:type="dxa"/>
+            <w:tcBorders>
+              <w:top w:val="single" w:sz="4" w:space="0" w:color="auto"/>
+              <w:left w:val="single" w:sz="4" w:space="0" w:color="auto"/>
+              <w:bottom w:val="single" w:sz="4" w:space="0" w:color="auto"/>
+              <w:right w:val="single" w:sz="4" w:space="0" w:color="auto"/>
+            </w:tcBorders>
+            <w:hideMark/>
+          </w:tcPr>
+          <w:p>
+            <w:pPr>
+              <w:widowControl w:val="0"/>
+              <w:spacing w:after="0" w:line="240" w:lineRule="auto"/>
+              <w:rPr>
+                <w:rFonts w:ascii="Times New Roman" w:eastAsia="等线" w:hAnsi="Times New Roman" w:cs="Times New Roman"/>
+                <w:kern w:val="0"/>
+                <w:lang w:val="en-US"/>
+                <w14:ligatures w14:val="none"/>
+              </w:rPr>
+            </w:pPr>
+            <w:r>
+              <w:rPr>
+                <w:rFonts w:ascii="Times New Roman" w:eastAsia="等线" w:hAnsi="Times New Roman" w:cs="Times New Roman"/>
+                <w:kern w:val="0"/>
+                <w:lang w:val="en-US"/>
+                <w14:ligatures w14:val="none"/>
+              </w:rPr>
+              <w:t>Sprint 3</w:t>
+            </w:r>
+          </w:p>
+        </w:tc>
+        <w:tc>
+          <w:tcPr>
+            <w:tcW w:w="2530" w:type="dxa"/>
+            <w:tcBorders>
+              <w:top w:val="single" w:sz="4" w:space="0" w:color="auto"/>
+              <w:left w:val="single" w:sz="4" w:space="0" w:color="auto"/>
+              <w:bottom w:val="single" w:sz="4" w:space="0" w:color="auto"/>
+              <w:right w:val="single" w:sz="4" w:space="0" w:color="auto"/>
+            </w:tcBorders>
+            <w:hideMark/>
+          </w:tcPr>
+          <w:p>
+            <w:pPr>
+              <w:widowControl w:val="0"/>
+              <w:spacing w:after="0" w:line="240" w:lineRule="auto"/>
+              <w:rPr>
+                <w:rFonts w:ascii="Times New Roman" w:eastAsia="等线" w:hAnsi="Times New Roman" w:cs="Times New Roman"/>
+                <w:kern w:val="0"/>
+                <w:lang w:val="en-US"/>
+                <w14:ligatures w14:val="none"/>
+              </w:rPr>
+            </w:pPr>
+            <w:r>
+              <w:rPr>
+                <w:rFonts w:ascii="Times New Roman" w:eastAsia="等线" w:hAnsi="Times New Roman" w:cs="Times New Roman"/>
+                <w:kern w:val="0"/>
+                <w:lang w:val="en-US"/>
+                <w14:ligatures w14:val="none"/>
+              </w:rPr>
+              <w:t>18</w:t>
+            </w:r>
+          </w:p>
+        </w:tc>
+        <w:tc>
+          <w:tcPr>
+            <w:tcW w:w="3794" w:type="dxa"/>
+            <w:tcBorders>
+              <w:top w:val="single" w:sz="4" w:space="0" w:color="auto"/>
+              <w:left w:val="single" w:sz="4" w:space="0" w:color="auto"/>
+              <w:bottom w:val="single" w:sz="4" w:space="0" w:color="auto"/>
+              <w:right w:val="single" w:sz="4" w:space="0" w:color="auto"/>
+            </w:tcBorders>
+            <w:hideMark/>
+          </w:tcPr>
+          <w:p>
+            <w:pPr>
+              <w:widowControl w:val="0"/>
+              <w:spacing w:after="0" w:line="240" w:lineRule="auto"/>
+              <w:rPr>
+                <w:rFonts w:ascii="Times New Roman" w:eastAsia="等线" w:hAnsi="Times New Roman" w:cs="Times New Roman"/>
+                <w:kern w:val="0"/>
+                <w:lang w:val="en-US"/>
+                <w14:ligatures w14:val="none"/>
+              </w:rPr>
+            </w:pPr>
+            <w:r>
+              <w:rPr>
+                <w:rFonts w:ascii="Times New Roman" w:eastAsia="等线" w:hAnsi="Times New Roman" w:cs="Times New Roman"/>
+                <w:kern w:val="0"/>
+                <w:lang w:val="en-US"/>
+                <w14:ligatures w14:val="none"/>
+              </w:rPr>
+              <w:t>AI features</w:t>
+            </w:r>
+          </w:p>
+        </w:tc>
+      </w:tr>
+      <w:tr>
+        <w:tc>
+          <w:tcPr>
+            <w:tcW w:w="3036" w:type="dxa"/>
+            <w:tcBorders>
+              <w:top w:val="single" w:sz="4" w:space="0" w:color="auto"/>
+              <w:left w:val="single" w:sz="4" w:space="0" w:color="auto"/>
+              <w:bottom w:val="single" w:sz="4" w:space="0" w:color="auto"/>
+              <w:right w:val="single" w:sz="4" w:space="0" w:color="auto"/>
+            </w:tcBorders>
+            <w:hideMark/>
+          </w:tcPr>
+          <w:p>
+            <w:pPr>
+              <w:widowControl w:val="0"/>
+              <w:spacing w:after="0" w:line="240" w:lineRule="auto"/>
+              <w:rPr>
+                <w:rFonts w:ascii="Times New Roman" w:eastAsia="等线" w:hAnsi="Times New Roman" w:cs="Times New Roman"/>
+                <w:kern w:val="0"/>
+                <w:lang w:val="en-US"/>
+                <w14:ligatures w14:val="none"/>
+              </w:rPr>
+            </w:pPr>
+            <w:r>
+              <w:rPr>
+                <w:rFonts w:ascii="Times New Roman" w:eastAsia="等线" w:hAnsi="Times New Roman" w:cs="Times New Roman"/>
+                <w:kern w:val="0"/>
+                <w:lang w:val="en-US"/>
+                <w14:ligatures w14:val="none"/>
+              </w:rPr>
+              <w:t>Sprint 4</w:t>
+            </w:r>
+          </w:p>
+        </w:tc>
+        <w:tc>
+          <w:tcPr>
+            <w:tcW w:w="2530" w:type="dxa"/>
+            <w:tcBorders>
+              <w:top w:val="single" w:sz="4" w:space="0" w:color="auto"/>
+              <w:left w:val="single" w:sz="4" w:space="0" w:color="auto"/>
+              <w:bottom w:val="single" w:sz="4" w:space="0" w:color="auto"/>
+              <w:right w:val="single" w:sz="4" w:space="0" w:color="auto"/>
+            </w:tcBorders>
+            <w:hideMark/>
+          </w:tcPr>
+          <w:p>
+            <w:pPr>
+              <w:widowControl w:val="0"/>
+              <w:spacing w:after="0" w:line="240" w:lineRule="auto"/>
+              <w:rPr>
+                <w:rFonts w:ascii="Times New Roman" w:eastAsia="等线" w:hAnsi="Times New Roman" w:cs="Times New Roman"/>
+                <w:kern w:val="0"/>
+                <w:lang w:val="en-US"/>
+                <w14:ligatures w14:val="none"/>
+              </w:rPr>
+            </w:pPr>
+            <w:r>
+              <w:rPr>
+                <w:rFonts w:ascii="Times New Roman" w:eastAsia="等线" w:hAnsi="Times New Roman" w:cs="Times New Roman"/>
+                <w:kern w:val="0"/>
+                <w:lang w:val="en-US"/>
+                <w14:ligatures w14:val="none"/>
+              </w:rPr>
+              <w:t>14</w:t>
+            </w:r>
+          </w:p>
+        </w:tc>
+        <w:tc>
+          <w:tcPr>
+            <w:tcW w:w="3794" w:type="dxa"/>
+            <w:tcBorders>
+              <w:top w:val="single" w:sz="4" w:space="0" w:color="auto"/>
+              <w:left w:val="single" w:sz="4" w:space="0" w:color="auto"/>
+              <w:bottom w:val="single" w:sz="4" w:space="0" w:color="auto"/>
+              <w:right w:val="single" w:sz="4" w:space="0" w:color="auto"/>
+            </w:tcBorders>
+            <w:hideMark/>
+          </w:tcPr>
+          <w:p>
+            <w:pPr>
+              <w:widowControl w:val="0"/>
+              <w:spacing w:after="0" w:line="240" w:lineRule="auto"/>
+              <w:rPr>
+                <w:rFonts w:ascii="Times New Roman" w:eastAsia="等线" w:hAnsi="Times New Roman" w:cs="Times New Roman"/>
+                <w:kern w:val="0"/>
+                <w:lang w:val="en-US"/>
+                <w14:ligatures w14:val="none"/>
+              </w:rPr>
+            </w:pPr>
+            <w:r>
+              <w:rPr>
+                <w:rFonts w:ascii="Times New Roman" w:eastAsia="等线" w:hAnsi="Times New Roman" w:cs="Times New Roman"/>
+                <w:kern w:val="0"/>
+                <w:lang w:val="en-US"/>
+                <w14:ligatures w14:val="none"/>
+              </w:rPr>
+              <w:t>Optimization</w:t>
+            </w:r>
+          </w:p>
+        </w:tc>
+      </w:tr>
+    </w:tbl>
+    <w:p>
+      <w:pPr>
+        <w:spacing w:after="200"/>
+      </w:pPr>
+    </w:p>
+    <w:p>
+      <w:pPr>
+        <w:pStyle w:val="2"/>
+        <w:spacing w:after="200"/>
+      </w:pPr>
+      <w:r>
+        <w:t>1.6 Summary</w:t>
+      </w:r>
+    </w:p>
+    <w:p>
+      <w:pPr>
+        <w:spacing w:after="120"/>
+      </w:pPr>
+      <w:r>
+        <w:t>This phase established the foundation for the TA Recruitment System through:</w:t>
+      </w:r>
+    </w:p>
+    <w:p>
+      <w:pPr>
+        <w:spacing w:after="200"/>
+      </w:pPr>
+      <w:r>
+        <w:t xml:space="preserve"> </w:t>
+      </w:r>
+    </w:p>
+    <w:p>
+      <w:pPr>
+        <w:spacing w:after="100"/>
+        <w:ind w:left="240"/>
+      </w:pPr>
+      <w:r>
+        <w:lastRenderedPageBreak/>
+        <w:t xml:space="preserve">1. </w:t>
+      </w:r>
       <w:r>
         <w:rPr>
-          <w:rFonts w:ascii="Times New Roman" w:hAnsi="Times New Roman" w:cs="Times New Roman"/>
-          <w:color w:val="FF0000"/>
+          <w:b/>
+          <w:bCs/>
         </w:rPr>
-        <w:t xml:space="preserve">No more than </w:t>
+        <w:t>Comprehensive Requirements Gathering</w:t>
+      </w:r>
+      <w:r>
+        <w:t>: Using multiple fact-finding techniques to capture all stakeholder needs</w:t>
+      </w:r>
+    </w:p>
+    <w:p>
+      <w:pPr>
+        <w:spacing w:after="100"/>
+        <w:ind w:left="240"/>
+      </w:pPr>
+      <w:r>
+        <w:t xml:space="preserve">2. </w:t>
       </w:r>
       <w:r>
         <w:rPr>
-          <w:rFonts w:ascii="Times New Roman" w:hAnsi="Times New Roman" w:cs="Times New Roman"/>
-          <w:color w:val="FF0000"/>
+          <w:b/>
+          <w:bCs/>
         </w:rPr>
-        <w:t>5</w:t>
+        <w:t>Structured Iteration Planning</w:t>
+      </w:r>
+      <w:r>
+        <w:t>: Dividing development into 4 manageable sprints across three assessment phases</w:t>
+      </w:r>
+    </w:p>
+    <w:p>
+      <w:pPr>
+        <w:spacing w:after="100"/>
+        <w:ind w:left="240"/>
+      </w:pPr>
+      <w:r>
+        <w:t xml:space="preserve">3. </w:t>
       </w:r>
       <w:r>
         <w:rPr>
-          <w:rFonts w:ascii="Times New Roman" w:hAnsi="Times New Roman" w:cs="Times New Roman"/>
-          <w:color w:val="FF0000"/>
+          <w:b/>
+          <w:bCs/>
         </w:rPr>
-        <w:t xml:space="preserve"> pages</w:t>
+        <w:t>Clear Prioritisation</w:t>
+      </w:r>
+      <w:r>
+        <w:t>: Applying MoSCoW method to focus on high-value features first</w:t>
+      </w:r>
+    </w:p>
+    <w:p>
+      <w:pPr>
+        <w:spacing w:after="100"/>
+        <w:ind w:left="240"/>
+      </w:pPr>
+      <w:r>
+        <w:t xml:space="preserve">4. </w:t>
       </w:r>
       <w:r>
         <w:rPr>
-          <w:rFonts w:ascii="Times New Roman" w:hAnsi="Times New Roman" w:cs="Times New Roman"/>
-          <w:color w:val="FF0000"/>
+          <w:b/>
+          <w:bCs/>
         </w:rPr>
-        <w:t>.</w:t>
-      </w:r>
-    </w:p>
-    <w:p>
-      <w:pPr>
-        <w:pStyle w:val="Heading2"/>
+        <w:t>Realistic Estimation</w:t>
+      </w:r>
+      <w:r>
+        <w:t>: Using Planning Poker for story point allocation based on team capacity</w:t>
+      </w:r>
+    </w:p>
+    <w:p>
+      <w:pPr>
+        <w:spacing w:after="200"/>
+      </w:pPr>
+      <w:r>
+        <w:t xml:space="preserve"> The Product Backlog contains 22 user stories with 75 total story points, ready for implementation in Phase 2.</w:t>
+      </w:r>
+    </w:p>
+    <w:p>
+      <w:pPr>
+        <w:pStyle w:val="2"/>
         <w:numPr>
           <w:ilvl w:val="0"/>
           <w:numId w:val="1"/>
@@ -659,33 +3264,233 @@
     </w:p>
     <w:p>
       <w:pPr>
-        <w:rPr>
-          <w:rFonts w:ascii="Times New Roman" w:hAnsi="Times New Roman" w:cs="Times New Roman"/>
-        </w:rPr>
-      </w:pPr>
-      <w:r>
-        <w:rPr>
-          <w:rFonts w:ascii="Times New Roman" w:hAnsi="Times New Roman" w:cs="Times New Roman"/>
-        </w:rPr>
-        <w:t>I</w:t>
-      </w:r>
-      <w:r>
-        <w:rPr>
-          <w:rFonts w:ascii="Times New Roman" w:hAnsi="Times New Roman" w:cs="Times New Roman"/>
-        </w:rPr>
-        <w:t xml:space="preserve">nclude supporting materials, such as interview questions, survey results, and customer feedback </w:t>
-      </w:r>
-      <w:r>
-        <w:rPr>
-          <w:rFonts w:ascii="Times New Roman" w:hAnsi="Times New Roman" w:cs="Times New Roman"/>
-        </w:rPr>
-        <w:t xml:space="preserve">etc </w:t>
-      </w:r>
-      <w:r>
-        <w:rPr>
-          <w:rFonts w:ascii="Times New Roman" w:hAnsi="Times New Roman" w:cs="Times New Roman"/>
-        </w:rPr>
-        <w:t>(if applicable).</w:t>
+        <w:pStyle w:val="2"/>
+        <w:spacing w:after="200"/>
+      </w:pPr>
+      <w:r>
+        <w:t>Appendix A: Interview Questions</w:t>
+      </w:r>
+    </w:p>
+    <w:p>
+      <w:pPr>
+        <w:pStyle w:val="3"/>
+        <w:spacing w:after="200"/>
+      </w:pPr>
+      <w:r>
+        <w:t>For Teaching Assistants</w:t>
+      </w:r>
+    </w:p>
+    <w:p>
+      <w:pPr>
+        <w:spacing w:after="100"/>
+        <w:ind w:left="240"/>
+      </w:pPr>
+      <w:r>
+        <w:t>1. What information would you include in your TA profile?</w:t>
+      </w:r>
+    </w:p>
+    <w:p>
+      <w:pPr>
+        <w:spacing w:after="100"/>
+        <w:ind w:left="240"/>
+      </w:pPr>
+      <w:r>
+        <w:t>2. How important is AI-based job recommendation?</w:t>
+      </w:r>
+    </w:p>
+    <w:p>
+      <w:pPr>
+        <w:spacing w:after="100"/>
+        <w:ind w:left="240"/>
+      </w:pPr>
+      <w:r>
+        <w:t>3. What factors influence your job application decision?</w:t>
+      </w:r>
+    </w:p>
+    <w:p>
+      <w:pPr>
+        <w:spacing w:after="100"/>
+        <w:ind w:left="240"/>
+      </w:pPr>
+      <w:r>
+        <w:t xml:space="preserve">4. How would you like to track application status? </w:t>
+      </w:r>
+    </w:p>
+    <w:p>
+      <w:pPr>
+        <w:pStyle w:val="3"/>
+        <w:spacing w:after="200"/>
+      </w:pPr>
+      <w:r>
+        <w:t>For Module Organizers</w:t>
+      </w:r>
+    </w:p>
+    <w:p>
+      <w:pPr>
+        <w:spacing w:after="100"/>
+        <w:ind w:left="240"/>
+      </w:pPr>
+      <w:r>
+        <w:t>1. What criteria do you use to select TA candidates?</w:t>
+      </w:r>
+    </w:p>
+    <w:p>
+      <w:pPr>
+        <w:spacing w:after="100"/>
+        <w:ind w:left="240"/>
+      </w:pPr>
+      <w:r>
+        <w:t>2. What skills are most important for your courses?</w:t>
+      </w:r>
+    </w:p>
+    <w:p>
+      <w:pPr>
+        <w:spacing w:after="100"/>
+        <w:ind w:left="240"/>
+      </w:pPr>
+      <w:r>
+        <w:t xml:space="preserve">3. Would AI-assisted candidate matching be helpful? </w:t>
+      </w:r>
+    </w:p>
+    <w:p>
+      <w:pPr>
+        <w:pStyle w:val="2"/>
+        <w:spacing w:after="200"/>
+      </w:pPr>
+      <w:r>
+        <w:t>Appendix B: Survey Results</w:t>
+      </w:r>
+    </w:p>
+    <w:p>
+      <w:pPr>
+        <w:pStyle w:val="3"/>
+        <w:spacing w:after="200"/>
+      </w:pPr>
+      <w:r>
+        <w:t>TA Survey Summary</w:t>
+      </w:r>
+    </w:p>
+    <w:p>
+      <w:pPr>
+        <w:pStyle w:val="a9"/>
+        <w:numPr>
+          <w:ilvl w:val="0"/>
+          <w:numId w:val="2"/>
+        </w:numPr>
+        <w:spacing w:after="100" w:line="240" w:lineRule="auto"/>
+        <w:ind w:left="240"/>
+        <w:contextualSpacing w:val="0"/>
+      </w:pPr>
+      <w:r>
+        <w:t xml:space="preserve"> prefer keyword search over category browse</w:t>
+      </w:r>
+    </w:p>
+    <w:p>
+      <w:pPr>
+        <w:pStyle w:val="a9"/>
+        <w:numPr>
+          <w:ilvl w:val="0"/>
+          <w:numId w:val="2"/>
+        </w:numPr>
+        <w:spacing w:after="100" w:line="240" w:lineRule="auto"/>
+        <w:ind w:left="240"/>
+        <w:contextualSpacing w:val="0"/>
+      </w:pPr>
+      <w:r>
+        <w:t>prefer PDF resume format</w:t>
+      </w:r>
+    </w:p>
+    <w:p>
+      <w:pPr>
+        <w:pStyle w:val="a9"/>
+        <w:numPr>
+          <w:ilvl w:val="0"/>
+          <w:numId w:val="2"/>
+        </w:numPr>
+        <w:spacing w:after="100" w:line="240" w:lineRule="auto"/>
+        <w:ind w:left="240"/>
+        <w:contextualSpacing w:val="0"/>
+      </w:pPr>
+      <w:r>
+        <w:t>want real-time application status updates</w:t>
+      </w:r>
+    </w:p>
+    <w:p>
+      <w:pPr>
+        <w:pStyle w:val="a9"/>
+        <w:numPr>
+          <w:ilvl w:val="0"/>
+          <w:numId w:val="2"/>
+        </w:numPr>
+        <w:spacing w:after="100" w:line="240" w:lineRule="auto"/>
+        <w:ind w:left="240"/>
+        <w:contextualSpacing w:val="0"/>
+      </w:pPr>
+      <w:r>
+        <w:t>interested in AI skill matching</w:t>
+      </w:r>
+    </w:p>
+    <w:p>
+      <w:pPr>
+        <w:spacing w:after="200"/>
+      </w:pPr>
+      <w:r>
+        <w:t xml:space="preserve"> </w:t>
+      </w:r>
+    </w:p>
+    <w:p>
+      <w:pPr>
+        <w:pStyle w:val="3"/>
+        <w:spacing w:after="200"/>
+      </w:pPr>
+      <w:r>
+        <w:t>MO Survey Summary</w:t>
+      </w:r>
+    </w:p>
+    <w:p>
+      <w:pPr>
+        <w:pStyle w:val="a9"/>
+        <w:numPr>
+          <w:ilvl w:val="0"/>
+          <w:numId w:val="2"/>
+        </w:numPr>
+        <w:spacing w:after="100" w:line="240" w:lineRule="auto"/>
+        <w:ind w:left="240"/>
+        <w:contextualSpacing w:val="0"/>
+      </w:pPr>
+      <w:r>
+        <w:t>prioritize skills match in selection</w:t>
+      </w:r>
+    </w:p>
+    <w:p>
+      <w:pPr>
+        <w:pStyle w:val="a9"/>
+        <w:numPr>
+          <w:ilvl w:val="0"/>
+          <w:numId w:val="2"/>
+        </w:numPr>
+        <w:spacing w:after="100" w:line="240" w:lineRule="auto"/>
+        <w:ind w:left="240"/>
+        <w:contextualSpacing w:val="0"/>
+      </w:pPr>
+      <w:r>
+        <w:lastRenderedPageBreak/>
+        <w:t>prefer combined profile + resume format</w:t>
+      </w:r>
+    </w:p>
+    <w:p>
+      <w:pPr>
+        <w:pStyle w:val="a9"/>
+        <w:numPr>
+          <w:ilvl w:val="0"/>
+          <w:numId w:val="2"/>
+        </w:numPr>
+        <w:spacing w:after="100" w:line="240" w:lineRule="auto"/>
+        <w:ind w:left="240"/>
+        <w:contextualSpacing w:val="0"/>
+      </w:pPr>
+      <w:r>
+        <w:t>find AI recommendations helpful</w:t>
       </w:r>
     </w:p>
     <w:sectPr>
@@ -734,7 +3539,6 @@
         <w:docPartUnique/>
       </w:docPartObj>
     </w:sdtPr>
-    <w:sdtEndPr/>
     <w:sdtContent>
       <w:sdt>
         <w:sdtPr>
@@ -744,11 +3548,10 @@
             <w:docPartUnique/>
           </w:docPartObj>
         </w:sdtPr>
-        <w:sdtEndPr/>
         <w:sdtContent>
           <w:p>
             <w:pPr>
-              <w:pStyle w:val="Footer"/>
+              <w:pStyle w:val="af1"/>
               <w:jc w:val="right"/>
             </w:pPr>
             <w:r>
@@ -850,7 +3653,7 @@
   </w:sdt>
   <w:p>
     <w:pPr>
-      <w:pStyle w:val="Footer"/>
+      <w:pStyle w:val="af1"/>
     </w:pPr>
   </w:p>
 </w:ftr>
@@ -884,6 +3687,92 @@
 <file path=word/numbering.xml><?xml version="1.0" encoding="utf-8"?>
 <w:numbering xmlns:wpc="http://schemas.microsoft.com/office/word/2010/wordprocessingCanvas" xmlns:cx="http://schemas.microsoft.com/office/drawing/2014/chartex" xmlns:cx1="http://schemas.microsoft.com/office/drawing/2015/9/8/chartex" xmlns:cx2="http://schemas.microsoft.com/office/drawing/2015/10/21/chartex" xmlns:cx3="http://schemas.microsoft.com/office/drawing/2016/5/9/chartex" xmlns:cx4="http://schemas.microsoft.com/office/drawing/2016/5/10/chartex" xmlns:cx5="http://schemas.microsoft.com/office/drawing/2016/5/11/chartex" xmlns:cx6="http://schemas.microsoft.com/office/drawing/2016/5/12/chartex" xmlns:cx7="http://schemas.microsoft.com/office/drawing/2016/5/13/chartex" xmlns:cx8="http://schemas.microsoft.com/office/drawing/2016/5/14/chartex" xmlns:mc="http://schemas.openxmlformats.org/markup-compatibility/2006" xmlns:aink="http://schemas.microsoft.com/office/drawing/2016/ink" xmlns:am3d="http://schemas.microsoft.com/office/drawing/2017/model3d" xmlns:o="urn:schemas-microsoft-com:office:office" xmlns:oel="http://schemas.microsoft.com/office/2019/extlst" xmlns:r="http://schemas.openxmlformats.org/officeDocument/2006/relationships" xmlns:m="http://schemas.openxmlformats.org/officeDocument/2006/math" xmlns:v="urn:schemas-microsoft-com:vml" xmlns:wp14="http://schemas.microsoft.com/office/word/2010/wordprocessingDrawing" xmlns:wp="http://schemas.openxmlformats.org/drawingml/2006/wordprocessingDrawing" xmlns:w10="urn:schemas-microsoft-com:office:word" xmlns:w="http://schemas.openxmlformats.org/wordprocessingml/2006/main" xmlns:w14="http://schemas.microsoft.com/office/word/2010/wordml" xmlns:w15="http://schemas.microsoft.com/office/word/2012/wordml" xmlns:w16cex="http://schemas.microsoft.com/office/word/2018/wordml/cex" xmlns:w16cid="http://schemas.microsoft.com/office/word/2016/wordml/cid" xmlns:w16="http://schemas.microsoft.com/office/word/2018/wordml" xmlns:w16du="http://schemas.microsoft.com/office/word/2023/wordml/word16du" xmlns:w16sdtdh="http://schemas.microsoft.com/office/word/2020/wordml/sdtdatahash" xmlns:w16sdtfl="http://schemas.microsoft.com/office/word/2024/wordml/sdtformatlock" xmlns:w16se="http://schemas.microsoft.com/office/word/2015/wordml/symex" xmlns:wpg="http://schemas.microsoft.com/office/word/2010/wordprocessingGroup" xmlns:wpi="http://schemas.microsoft.com/office/word/2010/wordprocessingInk" xmlns:wne="http://schemas.microsoft.com/office/word/2006/wordml" xmlns:wps="http://schemas.microsoft.com/office/word/2010/wordprocessingShape" mc:Ignorable="w14 w15 w16se w16cid w16 w16cex w16sdtdh w16sdtfl w16du wp14">
   <w:abstractNum w:abstractNumId="0" w15:restartNumberingAfterBreak="0">
+    <w:nsid w:val="22FD0E01"/>
+    <w:multiLevelType w:val="hybridMultilevel"/>
+    <w:tmpl w:val="FD74F8B8"/>
+    <w:lvl w:ilvl="0" w:tplc="54A6E64A">
+      <w:start w:val="1"/>
+      <w:numFmt w:val="bullet"/>
+      <w:lvlText w:val="●"/>
+      <w:lvlJc w:val="left"/>
+      <w:pPr>
+        <w:ind w:left="720" w:hanging="360"/>
+      </w:pPr>
+    </w:lvl>
+    <w:lvl w:ilvl="1" w:tplc="47920E74">
+      <w:start w:val="1"/>
+      <w:numFmt w:val="bullet"/>
+      <w:lvlText w:val="○"/>
+      <w:lvlJc w:val="left"/>
+      <w:pPr>
+        <w:ind w:left="1440" w:hanging="360"/>
+      </w:pPr>
+    </w:lvl>
+    <w:lvl w:ilvl="2" w:tplc="DEC6E236">
+      <w:start w:val="1"/>
+      <w:numFmt w:val="bullet"/>
+      <w:lvlText w:val="■"/>
+      <w:lvlJc w:val="left"/>
+      <w:pPr>
+        <w:ind w:left="2160" w:hanging="360"/>
+      </w:pPr>
+    </w:lvl>
+    <w:lvl w:ilvl="3" w:tplc="F3D01F66">
+      <w:start w:val="1"/>
+      <w:numFmt w:val="bullet"/>
+      <w:lvlText w:val="●"/>
+      <w:lvlJc w:val="left"/>
+      <w:pPr>
+        <w:ind w:left="2880" w:hanging="360"/>
+      </w:pPr>
+    </w:lvl>
+    <w:lvl w:ilvl="4" w:tplc="CD360EA6">
+      <w:start w:val="1"/>
+      <w:numFmt w:val="bullet"/>
+      <w:lvlText w:val="○"/>
+      <w:lvlJc w:val="left"/>
+      <w:pPr>
+        <w:ind w:left="3600" w:hanging="360"/>
+      </w:pPr>
+    </w:lvl>
+    <w:lvl w:ilvl="5" w:tplc="4FCCC44C">
+      <w:start w:val="1"/>
+      <w:numFmt w:val="bullet"/>
+      <w:lvlText w:val="■"/>
+      <w:lvlJc w:val="left"/>
+      <w:pPr>
+        <w:ind w:left="4320" w:hanging="360"/>
+      </w:pPr>
+    </w:lvl>
+    <w:lvl w:ilvl="6" w:tplc="50E278A8">
+      <w:start w:val="1"/>
+      <w:numFmt w:val="bullet"/>
+      <w:lvlText w:val="●"/>
+      <w:lvlJc w:val="left"/>
+      <w:pPr>
+        <w:ind w:left="5040" w:hanging="360"/>
+      </w:pPr>
+    </w:lvl>
+    <w:lvl w:ilvl="7" w:tplc="219E0F82">
+      <w:start w:val="1"/>
+      <w:numFmt w:val="bullet"/>
+      <w:lvlText w:val="●"/>
+      <w:lvlJc w:val="left"/>
+      <w:pPr>
+        <w:ind w:left="5760" w:hanging="360"/>
+      </w:pPr>
+    </w:lvl>
+    <w:lvl w:ilvl="8" w:tplc="3B88255A">
+      <w:start w:val="1"/>
+      <w:numFmt w:val="bullet"/>
+      <w:lvlText w:val="●"/>
+      <w:lvlJc w:val="left"/>
+      <w:pPr>
+        <w:ind w:left="6480" w:hanging="360"/>
+      </w:pPr>
+    </w:lvl>
+  </w:abstractNum>
+  <w:abstractNum w:abstractNumId="1" w15:restartNumberingAfterBreak="0">
     <w:nsid w:val="483F6021"/>
     <w:multiLevelType w:val="hybridMultilevel"/>
     <w:tmpl w:val="0A20ADFE"/>
@@ -969,8 +3858,112 @@
       </w:pPr>
     </w:lvl>
   </w:abstractNum>
+  <w:abstractNum w:abstractNumId="2" w15:restartNumberingAfterBreak="0">
+    <w:nsid w:val="49436016"/>
+    <w:multiLevelType w:val="hybridMultilevel"/>
+    <w:tmpl w:val="0146195A"/>
+    <w:lvl w:ilvl="0" w:tplc="1B608B30">
+      <w:start w:val="1"/>
+      <w:numFmt w:val="bullet"/>
+      <w:lvlText w:val="●"/>
+      <w:lvlJc w:val="left"/>
+      <w:pPr>
+        <w:ind w:left="720" w:hanging="360"/>
+      </w:pPr>
+    </w:lvl>
+    <w:lvl w:ilvl="1" w:tplc="19C4EA84">
+      <w:start w:val="1"/>
+      <w:numFmt w:val="bullet"/>
+      <w:lvlText w:val="○"/>
+      <w:lvlJc w:val="left"/>
+      <w:pPr>
+        <w:ind w:left="1440" w:hanging="360"/>
+      </w:pPr>
+    </w:lvl>
+    <w:lvl w:ilvl="2" w:tplc="56B846D4">
+      <w:start w:val="1"/>
+      <w:numFmt w:val="bullet"/>
+      <w:lvlText w:val="■"/>
+      <w:lvlJc w:val="left"/>
+      <w:pPr>
+        <w:ind w:left="2160" w:hanging="360"/>
+      </w:pPr>
+    </w:lvl>
+    <w:lvl w:ilvl="3" w:tplc="B2C251E6">
+      <w:start w:val="1"/>
+      <w:numFmt w:val="bullet"/>
+      <w:lvlText w:val="●"/>
+      <w:lvlJc w:val="left"/>
+      <w:pPr>
+        <w:ind w:left="2880" w:hanging="360"/>
+      </w:pPr>
+    </w:lvl>
+    <w:lvl w:ilvl="4" w:tplc="4994440A">
+      <w:start w:val="1"/>
+      <w:numFmt w:val="bullet"/>
+      <w:lvlText w:val="○"/>
+      <w:lvlJc w:val="left"/>
+      <w:pPr>
+        <w:ind w:left="3600" w:hanging="360"/>
+      </w:pPr>
+    </w:lvl>
+    <w:lvl w:ilvl="5" w:tplc="854647E2">
+      <w:start w:val="1"/>
+      <w:numFmt w:val="bullet"/>
+      <w:lvlText w:val="■"/>
+      <w:lvlJc w:val="left"/>
+      <w:pPr>
+        <w:ind w:left="4320" w:hanging="360"/>
+      </w:pPr>
+    </w:lvl>
+    <w:lvl w:ilvl="6" w:tplc="1F960F20">
+      <w:start w:val="1"/>
+      <w:numFmt w:val="bullet"/>
+      <w:lvlText w:val="●"/>
+      <w:lvlJc w:val="left"/>
+      <w:pPr>
+        <w:ind w:left="5040" w:hanging="360"/>
+      </w:pPr>
+    </w:lvl>
+    <w:lvl w:ilvl="7" w:tplc="A9BE4EA2">
+      <w:start w:val="1"/>
+      <w:numFmt w:val="bullet"/>
+      <w:lvlText w:val="●"/>
+      <w:lvlJc w:val="left"/>
+      <w:pPr>
+        <w:ind w:left="5760" w:hanging="360"/>
+      </w:pPr>
+    </w:lvl>
+    <w:lvl w:ilvl="8" w:tplc="24D8BEF2">
+      <w:start w:val="1"/>
+      <w:numFmt w:val="bullet"/>
+      <w:lvlText w:val="●"/>
+      <w:lvlJc w:val="left"/>
+      <w:pPr>
+        <w:ind w:left="6480" w:hanging="360"/>
+      </w:pPr>
+    </w:lvl>
+  </w:abstractNum>
   <w:num w:numId="1" w16cid:durableId="2045015159">
+    <w:abstractNumId w:val="1"/>
+  </w:num>
+  <w:num w:numId="2" w16cid:durableId="1748769965">
+    <w:abstractNumId w:val="2"/>
+    <w:lvlOverride w:ilvl="0"/>
+    <w:lvlOverride w:ilvl="1"/>
+    <w:lvlOverride w:ilvl="2"/>
+    <w:lvlOverride w:ilvl="3"/>
+    <w:lvlOverride w:ilvl="4"/>
+    <w:lvlOverride w:ilvl="5"/>
+    <w:lvlOverride w:ilvl="6"/>
+    <w:lvlOverride w:ilvl="7"/>
+    <w:lvlOverride w:ilvl="8"/>
+  </w:num>
+  <w:num w:numId="3" w16cid:durableId="935019245">
     <w:abstractNumId w:val="0"/>
+    <w:lvlOverride w:ilvl="0">
+      <w:startOverride w:val="1"/>
+    </w:lvlOverride>
   </w:num>
 </w:numbering>
 </file>
@@ -1174,7 +4167,7 @@
     <w:lsdException w:name="Medium Shading 2 Accent 1" w:uiPriority="64"/>
     <w:lsdException w:name="Medium List 1 Accent 1" w:uiPriority="65"/>
     <w:lsdException w:name="Revision" w:semiHidden="1"/>
-    <w:lsdException w:name="List Paragraph" w:uiPriority="34" w:qFormat="1"/>
+    <w:lsdException w:name="List Paragraph" w:uiPriority="0" w:qFormat="1"/>
     <w:lsdException w:name="Quote" w:uiPriority="29" w:qFormat="1"/>
     <w:lsdException w:name="Intense Quote" w:uiPriority="30" w:qFormat="1"/>
     <w:lsdException w:name="Medium List 2 Accent 1" w:uiPriority="66"/>
@@ -1372,16 +4365,16 @@
     <w:lsdException w:name="Unresolved Mention" w:semiHidden="1" w:unhideWhenUsed="1"/>
     <w:lsdException w:name="Smart Link" w:semiHidden="1" w:unhideWhenUsed="1"/>
   </w:latentStyles>
-  <w:style w:type="paragraph" w:default="1" w:styleId="Normal">
+  <w:style w:type="paragraph" w:default="1" w:styleId="a">
     <w:name w:val="Normal"/>
     <w:qFormat/>
     <w:rsid w:val="0062598B"/>
   </w:style>
-  <w:style w:type="paragraph" w:styleId="Heading1">
+  <w:style w:type="paragraph" w:styleId="1">
     <w:name w:val="heading 1"/>
-    <w:basedOn w:val="Normal"/>
-    <w:next w:val="Normal"/>
-    <w:link w:val="Heading1Char"/>
+    <w:basedOn w:val="a"/>
+    <w:next w:val="a"/>
+    <w:link w:val="10"/>
     <w:uiPriority w:val="9"/>
     <w:qFormat/>
     <w:rsid w:val="00B77264"/>
@@ -1398,11 +4391,11 @@
       <w:szCs w:val="40"/>
     </w:rPr>
   </w:style>
-  <w:style w:type="paragraph" w:styleId="Heading2">
+  <w:style w:type="paragraph" w:styleId="2">
     <w:name w:val="heading 2"/>
-    <w:basedOn w:val="Normal"/>
-    <w:next w:val="Normal"/>
-    <w:link w:val="Heading2Char"/>
+    <w:basedOn w:val="a"/>
+    <w:next w:val="a"/>
+    <w:link w:val="20"/>
     <w:uiPriority w:val="9"/>
     <w:unhideWhenUsed/>
     <w:qFormat/>
@@ -1420,13 +4413,12 @@
       <w:szCs w:val="32"/>
     </w:rPr>
   </w:style>
-  <w:style w:type="paragraph" w:styleId="Heading3">
+  <w:style w:type="paragraph" w:styleId="3">
     <w:name w:val="heading 3"/>
-    <w:basedOn w:val="Normal"/>
-    <w:next w:val="Normal"/>
-    <w:link w:val="Heading3Char"/>
+    <w:basedOn w:val="a"/>
+    <w:next w:val="a"/>
+    <w:link w:val="30"/>
     <w:uiPriority w:val="9"/>
-    <w:semiHidden/>
     <w:unhideWhenUsed/>
     <w:qFormat/>
     <w:rsid w:val="00B77264"/>
@@ -1443,13 +4435,12 @@
       <w:szCs w:val="28"/>
     </w:rPr>
   </w:style>
-  <w:style w:type="paragraph" w:styleId="Heading4">
+  <w:style w:type="paragraph" w:styleId="4">
     <w:name w:val="heading 4"/>
-    <w:basedOn w:val="Normal"/>
-    <w:next w:val="Normal"/>
-    <w:link w:val="Heading4Char"/>
+    <w:basedOn w:val="a"/>
+    <w:next w:val="a"/>
+    <w:link w:val="40"/>
     <w:uiPriority w:val="9"/>
-    <w:semiHidden/>
     <w:unhideWhenUsed/>
     <w:qFormat/>
     <w:rsid w:val="00B77264"/>
@@ -1466,11 +4457,11 @@
       <w:color w:val="0F4761" w:themeColor="accent1" w:themeShade="BF"/>
     </w:rPr>
   </w:style>
-  <w:style w:type="paragraph" w:styleId="Heading5">
+  <w:style w:type="paragraph" w:styleId="5">
     <w:name w:val="heading 5"/>
-    <w:basedOn w:val="Normal"/>
-    <w:next w:val="Normal"/>
-    <w:link w:val="Heading5Char"/>
+    <w:basedOn w:val="a"/>
+    <w:next w:val="a"/>
+    <w:link w:val="50"/>
     <w:uiPriority w:val="9"/>
     <w:semiHidden/>
     <w:unhideWhenUsed/>
@@ -1487,11 +4478,11 @@
       <w:color w:val="0F4761" w:themeColor="accent1" w:themeShade="BF"/>
     </w:rPr>
   </w:style>
-  <w:style w:type="paragraph" w:styleId="Heading6">
+  <w:style w:type="paragraph" w:styleId="6">
     <w:name w:val="heading 6"/>
-    <w:basedOn w:val="Normal"/>
-    <w:next w:val="Normal"/>
-    <w:link w:val="Heading6Char"/>
+    <w:basedOn w:val="a"/>
+    <w:next w:val="a"/>
+    <w:link w:val="60"/>
     <w:uiPriority w:val="9"/>
     <w:semiHidden/>
     <w:unhideWhenUsed/>
@@ -1510,11 +4501,11 @@
       <w:color w:val="595959" w:themeColor="text1" w:themeTint="A6"/>
     </w:rPr>
   </w:style>
-  <w:style w:type="paragraph" w:styleId="Heading7">
+  <w:style w:type="paragraph" w:styleId="7">
     <w:name w:val="heading 7"/>
-    <w:basedOn w:val="Normal"/>
-    <w:next w:val="Normal"/>
-    <w:link w:val="Heading7Char"/>
+    <w:basedOn w:val="a"/>
+    <w:next w:val="a"/>
+    <w:link w:val="70"/>
     <w:uiPriority w:val="9"/>
     <w:semiHidden/>
     <w:unhideWhenUsed/>
@@ -1531,11 +4522,11 @@
       <w:color w:val="595959" w:themeColor="text1" w:themeTint="A6"/>
     </w:rPr>
   </w:style>
-  <w:style w:type="paragraph" w:styleId="Heading8">
+  <w:style w:type="paragraph" w:styleId="8">
     <w:name w:val="heading 8"/>
-    <w:basedOn w:val="Normal"/>
-    <w:next w:val="Normal"/>
-    <w:link w:val="Heading8Char"/>
+    <w:basedOn w:val="a"/>
+    <w:next w:val="a"/>
+    <w:link w:val="80"/>
     <w:uiPriority w:val="9"/>
     <w:semiHidden/>
     <w:unhideWhenUsed/>
@@ -1554,11 +4545,11 @@
       <w:color w:val="272727" w:themeColor="text1" w:themeTint="D8"/>
     </w:rPr>
   </w:style>
-  <w:style w:type="paragraph" w:styleId="Heading9">
+  <w:style w:type="paragraph" w:styleId="9">
     <w:name w:val="heading 9"/>
-    <w:basedOn w:val="Normal"/>
-    <w:next w:val="Normal"/>
-    <w:link w:val="Heading9Char"/>
+    <w:basedOn w:val="a"/>
+    <w:next w:val="a"/>
+    <w:link w:val="90"/>
     <w:uiPriority w:val="9"/>
     <w:semiHidden/>
     <w:unhideWhenUsed/>
@@ -1575,13 +4566,13 @@
       <w:color w:val="272727" w:themeColor="text1" w:themeTint="D8"/>
     </w:rPr>
   </w:style>
-  <w:style w:type="character" w:default="1" w:styleId="DefaultParagraphFont">
+  <w:style w:type="character" w:default="1" w:styleId="a0">
     <w:name w:val="Default Paragraph Font"/>
     <w:uiPriority w:val="1"/>
     <w:semiHidden/>
     <w:unhideWhenUsed/>
   </w:style>
-  <w:style w:type="table" w:default="1" w:styleId="TableNormal">
+  <w:style w:type="table" w:default="1" w:styleId="a1">
     <w:name w:val="Normal Table"/>
     <w:uiPriority w:val="99"/>
     <w:semiHidden/>
@@ -1596,16 +4587,16 @@
       </w:tblCellMar>
     </w:tblPr>
   </w:style>
-  <w:style w:type="numbering" w:default="1" w:styleId="NoList">
+  <w:style w:type="numbering" w:default="1" w:styleId="a2">
     <w:name w:val="No List"/>
     <w:uiPriority w:val="99"/>
     <w:semiHidden/>
     <w:unhideWhenUsed/>
   </w:style>
-  <w:style w:type="character" w:customStyle="1" w:styleId="Heading1Char">
-    <w:name w:val="Heading 1 Char"/>
-    <w:basedOn w:val="DefaultParagraphFont"/>
-    <w:link w:val="Heading1"/>
+  <w:style w:type="character" w:customStyle="1" w:styleId="10">
+    <w:name w:val="标题 1 字符"/>
+    <w:basedOn w:val="a0"/>
+    <w:link w:val="1"/>
     <w:uiPriority w:val="9"/>
     <w:rsid w:val="00B77264"/>
     <w:rPr>
@@ -1615,10 +4606,10 @@
       <w:szCs w:val="40"/>
     </w:rPr>
   </w:style>
-  <w:style w:type="character" w:customStyle="1" w:styleId="Heading2Char">
-    <w:name w:val="Heading 2 Char"/>
-    <w:basedOn w:val="DefaultParagraphFont"/>
-    <w:link w:val="Heading2"/>
+  <w:style w:type="character" w:customStyle="1" w:styleId="20">
+    <w:name w:val="标题 2 字符"/>
+    <w:basedOn w:val="a0"/>
+    <w:link w:val="2"/>
     <w:uiPriority w:val="9"/>
     <w:rsid w:val="00B77264"/>
     <w:rPr>
@@ -1628,12 +4619,11 @@
       <w:szCs w:val="32"/>
     </w:rPr>
   </w:style>
-  <w:style w:type="character" w:customStyle="1" w:styleId="Heading3Char">
-    <w:name w:val="Heading 3 Char"/>
-    <w:basedOn w:val="DefaultParagraphFont"/>
-    <w:link w:val="Heading3"/>
+  <w:style w:type="character" w:customStyle="1" w:styleId="30">
+    <w:name w:val="标题 3 字符"/>
+    <w:basedOn w:val="a0"/>
+    <w:link w:val="3"/>
     <w:uiPriority w:val="9"/>
-    <w:semiHidden/>
     <w:rsid w:val="00B77264"/>
     <w:rPr>
       <w:rFonts w:eastAsiaTheme="majorEastAsia" w:cstheme="majorBidi"/>
@@ -1642,12 +4632,11 @@
       <w:szCs w:val="28"/>
     </w:rPr>
   </w:style>
-  <w:style w:type="character" w:customStyle="1" w:styleId="Heading4Char">
-    <w:name w:val="Heading 4 Char"/>
-    <w:basedOn w:val="DefaultParagraphFont"/>
-    <w:link w:val="Heading4"/>
+  <w:style w:type="character" w:customStyle="1" w:styleId="40">
+    <w:name w:val="标题 4 字符"/>
+    <w:basedOn w:val="a0"/>
+    <w:link w:val="4"/>
     <w:uiPriority w:val="9"/>
-    <w:semiHidden/>
     <w:rsid w:val="00B77264"/>
     <w:rPr>
       <w:rFonts w:eastAsiaTheme="majorEastAsia" w:cstheme="majorBidi"/>
@@ -1656,10 +4645,10 @@
       <w:color w:val="0F4761" w:themeColor="accent1" w:themeShade="BF"/>
     </w:rPr>
   </w:style>
-  <w:style w:type="character" w:customStyle="1" w:styleId="Heading5Char">
-    <w:name w:val="Heading 5 Char"/>
-    <w:basedOn w:val="DefaultParagraphFont"/>
-    <w:link w:val="Heading5"/>
+  <w:style w:type="character" w:customStyle="1" w:styleId="50">
+    <w:name w:val="标题 5 字符"/>
+    <w:basedOn w:val="a0"/>
+    <w:link w:val="5"/>
     <w:uiPriority w:val="9"/>
     <w:semiHidden/>
     <w:rsid w:val="00B77264"/>
@@ -1668,10 +4657,10 @@
       <w:color w:val="0F4761" w:themeColor="accent1" w:themeShade="BF"/>
     </w:rPr>
   </w:style>
-  <w:style w:type="character" w:customStyle="1" w:styleId="Heading6Char">
-    <w:name w:val="Heading 6 Char"/>
-    <w:basedOn w:val="DefaultParagraphFont"/>
-    <w:link w:val="Heading6"/>
+  <w:style w:type="character" w:customStyle="1" w:styleId="60">
+    <w:name w:val="标题 6 字符"/>
+    <w:basedOn w:val="a0"/>
+    <w:link w:val="6"/>
     <w:uiPriority w:val="9"/>
     <w:semiHidden/>
     <w:rsid w:val="00B77264"/>
@@ -1682,10 +4671,10 @@
       <w:color w:val="595959" w:themeColor="text1" w:themeTint="A6"/>
     </w:rPr>
   </w:style>
-  <w:style w:type="character" w:customStyle="1" w:styleId="Heading7Char">
-    <w:name w:val="Heading 7 Char"/>
-    <w:basedOn w:val="DefaultParagraphFont"/>
-    <w:link w:val="Heading7"/>
+  <w:style w:type="character" w:customStyle="1" w:styleId="70">
+    <w:name w:val="标题 7 字符"/>
+    <w:basedOn w:val="a0"/>
+    <w:link w:val="7"/>
     <w:uiPriority w:val="9"/>
     <w:semiHidden/>
     <w:rsid w:val="00B77264"/>
@@ -1694,10 +4683,10 @@
       <w:color w:val="595959" w:themeColor="text1" w:themeTint="A6"/>
     </w:rPr>
   </w:style>
-  <w:style w:type="character" w:customStyle="1" w:styleId="Heading8Char">
-    <w:name w:val="Heading 8 Char"/>
-    <w:basedOn w:val="DefaultParagraphFont"/>
-    <w:link w:val="Heading8"/>
+  <w:style w:type="character" w:customStyle="1" w:styleId="80">
+    <w:name w:val="标题 8 字符"/>
+    <w:basedOn w:val="a0"/>
+    <w:link w:val="8"/>
     <w:uiPriority w:val="9"/>
     <w:semiHidden/>
     <w:rsid w:val="00B77264"/>
@@ -1708,10 +4697,10 @@
       <w:color w:val="272727" w:themeColor="text1" w:themeTint="D8"/>
     </w:rPr>
   </w:style>
-  <w:style w:type="character" w:customStyle="1" w:styleId="Heading9Char">
-    <w:name w:val="Heading 9 Char"/>
-    <w:basedOn w:val="DefaultParagraphFont"/>
-    <w:link w:val="Heading9"/>
+  <w:style w:type="character" w:customStyle="1" w:styleId="90">
+    <w:name w:val="标题 9 字符"/>
+    <w:basedOn w:val="a0"/>
+    <w:link w:val="9"/>
     <w:uiPriority w:val="9"/>
     <w:semiHidden/>
     <w:rsid w:val="00B77264"/>
@@ -1720,11 +4709,11 @@
       <w:color w:val="272727" w:themeColor="text1" w:themeTint="D8"/>
     </w:rPr>
   </w:style>
-  <w:style w:type="paragraph" w:styleId="Title">
+  <w:style w:type="paragraph" w:styleId="a3">
     <w:name w:val="Title"/>
-    <w:basedOn w:val="Normal"/>
-    <w:next w:val="Normal"/>
-    <w:link w:val="TitleChar"/>
+    <w:basedOn w:val="a"/>
+    <w:next w:val="a"/>
+    <w:link w:val="a4"/>
     <w:uiPriority w:val="10"/>
     <w:qFormat/>
     <w:rsid w:val="00B77264"/>
@@ -1740,10 +4729,10 @@
       <w:szCs w:val="56"/>
     </w:rPr>
   </w:style>
-  <w:style w:type="character" w:customStyle="1" w:styleId="TitleChar">
-    <w:name w:val="Title Char"/>
-    <w:basedOn w:val="DefaultParagraphFont"/>
-    <w:link w:val="Title"/>
+  <w:style w:type="character" w:customStyle="1" w:styleId="a4">
+    <w:name w:val="标题 字符"/>
+    <w:basedOn w:val="a0"/>
+    <w:link w:val="a3"/>
     <w:uiPriority w:val="10"/>
     <w:rsid w:val="00B77264"/>
     <w:rPr>
@@ -1754,11 +4743,11 @@
       <w:szCs w:val="56"/>
     </w:rPr>
   </w:style>
-  <w:style w:type="paragraph" w:styleId="Subtitle">
+  <w:style w:type="paragraph" w:styleId="a5">
     <w:name w:val="Subtitle"/>
-    <w:basedOn w:val="Normal"/>
-    <w:next w:val="Normal"/>
-    <w:link w:val="SubtitleChar"/>
+    <w:basedOn w:val="a"/>
+    <w:next w:val="a"/>
+    <w:link w:val="a6"/>
     <w:uiPriority w:val="11"/>
     <w:qFormat/>
     <w:rsid w:val="00B77264"/>
@@ -1775,10 +4764,10 @@
       <w:szCs w:val="28"/>
     </w:rPr>
   </w:style>
-  <w:style w:type="character" w:customStyle="1" w:styleId="SubtitleChar">
-    <w:name w:val="Subtitle Char"/>
-    <w:basedOn w:val="DefaultParagraphFont"/>
-    <w:link w:val="Subtitle"/>
+  <w:style w:type="character" w:customStyle="1" w:styleId="a6">
+    <w:name w:val="副标题 字符"/>
+    <w:basedOn w:val="a0"/>
+    <w:link w:val="a5"/>
     <w:uiPriority w:val="11"/>
     <w:rsid w:val="00B77264"/>
     <w:rPr>
@@ -1789,11 +4778,11 @@
       <w:szCs w:val="28"/>
     </w:rPr>
   </w:style>
-  <w:style w:type="paragraph" w:styleId="Quote">
+  <w:style w:type="paragraph" w:styleId="a7">
     <w:name w:val="Quote"/>
-    <w:basedOn w:val="Normal"/>
-    <w:next w:val="Normal"/>
-    <w:link w:val="QuoteChar"/>
+    <w:basedOn w:val="a"/>
+    <w:next w:val="a"/>
+    <w:link w:val="a8"/>
     <w:uiPriority w:val="29"/>
     <w:qFormat/>
     <w:rsid w:val="00B77264"/>
@@ -1807,10 +4796,10 @@
       <w:color w:val="404040" w:themeColor="text1" w:themeTint="BF"/>
     </w:rPr>
   </w:style>
-  <w:style w:type="character" w:customStyle="1" w:styleId="QuoteChar">
-    <w:name w:val="Quote Char"/>
-    <w:basedOn w:val="DefaultParagraphFont"/>
-    <w:link w:val="Quote"/>
+  <w:style w:type="character" w:customStyle="1" w:styleId="a8">
+    <w:name w:val="引用 字符"/>
+    <w:basedOn w:val="a0"/>
+    <w:link w:val="a7"/>
     <w:uiPriority w:val="29"/>
     <w:rsid w:val="00B77264"/>
     <w:rPr>
@@ -1819,10 +4808,9 @@
       <w:color w:val="404040" w:themeColor="text1" w:themeTint="BF"/>
     </w:rPr>
   </w:style>
-  <w:style w:type="paragraph" w:styleId="ListParagraph">
+  <w:style w:type="paragraph" w:styleId="a9">
     <w:name w:val="List Paragraph"/>
-    <w:basedOn w:val="Normal"/>
-    <w:uiPriority w:val="34"/>
+    <w:basedOn w:val="a"/>
     <w:qFormat/>
     <w:rsid w:val="00B77264"/>
     <w:pPr>
@@ -1830,9 +4818,9 @@
       <w:contextualSpacing/>
     </w:pPr>
   </w:style>
-  <w:style w:type="character" w:styleId="IntenseEmphasis">
+  <w:style w:type="character" w:styleId="aa">
     <w:name w:val="Intense Emphasis"/>
-    <w:basedOn w:val="DefaultParagraphFont"/>
+    <w:basedOn w:val="a0"/>
     <w:uiPriority w:val="21"/>
     <w:qFormat/>
     <w:rsid w:val="00B77264"/>
@@ -1842,11 +4830,11 @@
       <w:color w:val="0F4761" w:themeColor="accent1" w:themeShade="BF"/>
     </w:rPr>
   </w:style>
-  <w:style w:type="paragraph" w:styleId="IntenseQuote">
+  <w:style w:type="paragraph" w:styleId="ab">
     <w:name w:val="Intense Quote"/>
-    <w:basedOn w:val="Normal"/>
-    <w:next w:val="Normal"/>
-    <w:link w:val="IntenseQuoteChar"/>
+    <w:basedOn w:val="a"/>
+    <w:next w:val="a"/>
+    <w:link w:val="ac"/>
     <w:uiPriority w:val="30"/>
     <w:qFormat/>
     <w:rsid w:val="00B77264"/>
@@ -1865,10 +4853,10 @@
       <w:color w:val="0F4761" w:themeColor="accent1" w:themeShade="BF"/>
     </w:rPr>
   </w:style>
-  <w:style w:type="character" w:customStyle="1" w:styleId="IntenseQuoteChar">
-    <w:name w:val="Intense Quote Char"/>
-    <w:basedOn w:val="DefaultParagraphFont"/>
-    <w:link w:val="IntenseQuote"/>
+  <w:style w:type="character" w:customStyle="1" w:styleId="ac">
+    <w:name w:val="明显引用 字符"/>
+    <w:basedOn w:val="a0"/>
+    <w:link w:val="ab"/>
     <w:uiPriority w:val="30"/>
     <w:rsid w:val="00B77264"/>
     <w:rPr>
@@ -1877,9 +4865,9 @@
       <w:color w:val="0F4761" w:themeColor="accent1" w:themeShade="BF"/>
     </w:rPr>
   </w:style>
-  <w:style w:type="character" w:styleId="IntenseReference">
+  <w:style w:type="character" w:styleId="ad">
     <w:name w:val="Intense Reference"/>
-    <w:basedOn w:val="DefaultParagraphFont"/>
+    <w:basedOn w:val="a0"/>
     <w:uiPriority w:val="32"/>
     <w:qFormat/>
     <w:rsid w:val="00B77264"/>
@@ -1891,9 +4879,9 @@
       <w:spacing w:val="5"/>
     </w:rPr>
   </w:style>
-  <w:style w:type="table" w:styleId="TableGrid">
+  <w:style w:type="table" w:styleId="ae">
     <w:name w:val="Table Grid"/>
-    <w:basedOn w:val="TableNormal"/>
+    <w:basedOn w:val="a1"/>
     <w:uiPriority w:val="39"/>
     <w:rsid w:val="00C352F9"/>
     <w:pPr>
@@ -1910,10 +4898,10 @@
       </w:tblBorders>
     </w:tblPr>
   </w:style>
-  <w:style w:type="paragraph" w:styleId="Header">
+  <w:style w:type="paragraph" w:styleId="af">
     <w:name w:val="header"/>
-    <w:basedOn w:val="Normal"/>
-    <w:link w:val="HeaderChar"/>
+    <w:basedOn w:val="a"/>
+    <w:link w:val="af0"/>
     <w:uiPriority w:val="99"/>
     <w:unhideWhenUsed/>
     <w:rsid w:val="00E5080D"/>
@@ -1925,17 +4913,17 @@
       <w:spacing w:after="0" w:line="240" w:lineRule="auto"/>
     </w:pPr>
   </w:style>
-  <w:style w:type="character" w:customStyle="1" w:styleId="HeaderChar">
-    <w:name w:val="Header Char"/>
-    <w:basedOn w:val="DefaultParagraphFont"/>
-    <w:link w:val="Header"/>
+  <w:style w:type="character" w:customStyle="1" w:styleId="af0">
+    <w:name w:val="页眉 字符"/>
+    <w:basedOn w:val="a0"/>
+    <w:link w:val="af"/>
     <w:uiPriority w:val="99"/>
     <w:rsid w:val="00E5080D"/>
   </w:style>
-  <w:style w:type="paragraph" w:styleId="Footer">
+  <w:style w:type="paragraph" w:styleId="af1">
     <w:name w:val="footer"/>
-    <w:basedOn w:val="Normal"/>
-    <w:link w:val="FooterChar"/>
+    <w:basedOn w:val="a"/>
+    <w:link w:val="af2"/>
     <w:uiPriority w:val="99"/>
     <w:unhideWhenUsed/>
     <w:rsid w:val="00E5080D"/>
@@ -1947,10 +4935,10 @@
       <w:spacing w:after="0" w:line="240" w:lineRule="auto"/>
     </w:pPr>
   </w:style>
-  <w:style w:type="character" w:customStyle="1" w:styleId="FooterChar">
-    <w:name w:val="Footer Char"/>
-    <w:basedOn w:val="DefaultParagraphFont"/>
-    <w:link w:val="Footer"/>
+  <w:style w:type="character" w:customStyle="1" w:styleId="af2">
+    <w:name w:val="页脚 字符"/>
+    <w:basedOn w:val="a0"/>
+    <w:link w:val="af1"/>
     <w:uiPriority w:val="99"/>
     <w:rsid w:val="00E5080D"/>
   </w:style>

</xml_diff>